<commit_message>
feat(DOC-33): complete audit trail, data governance & compliance control engine with SHA-256 hash chaining and Selenium verification
</commit_message>
<xml_diff>
--- a/ERP_ENTERPRISE_SYSTEM_COMPLETE_SOFTWARE_MASTER_WALKTHROUGH.docx
+++ b/ERP_ENTERPRISE_SYSTEM_COMPLETE_SOFTWARE_MASTER_WALKTHROUGH.docx
@@ -5234,7 +5234,7 @@
           <w:color w:val="1B4332"/>
           <w:sz w:val="36"/>
         </w:rPr>
-        <w:t>11. Relational Database Schema Dictionary (PostgreSQL)</w:t>
+        <w:t>11. Audit Trail, Data Governance &amp; Compliance Control Engine (DOC-33)</w:t>
       </w:r>
     </w:p>
     <w:p>
@@ -5250,7 +5250,183 @@
           <w:color w:val="1E293B"/>
           <w:sz w:val="21"/>
         </w:rPr>
-        <w:t>The database architecture encompasses 18+ high-performance relational tables:</w:t>
+        <w:t>DOC-33 serves as the cryptographic trust and regulatory governance spine of the enterprise platform, enforcing mathematical non-repudiation, tamper detection, and statutory record retention across all ledger postings, master data adjustments, and approval actions.</w:t>
+      </w:r>
+    </w:p>
+    <w:p>
+      <w:pPr>
+        <w:keepNext/>
+        <w:spacing w:before="280" w:after="120"/>
+      </w:pPr>
+      <w:r>
+        <w:rPr>
+          <w:rFonts w:ascii="Segoe UI" w:hAnsi="Segoe UI"/>
+          <w:b/>
+          <w:i w:val="0"/>
+          <w:color w:val="2D6A4F"/>
+          <w:sz w:val="27"/>
+        </w:rPr>
+        <w:t>11.1 Non-Negotiable Compliance Architecture</w:t>
+      </w:r>
+    </w:p>
+    <w:p>
+      <w:pPr>
+        <w:spacing w:before="0" w:after="120" w:line="276" w:lineRule="auto"/>
+        <w:jc w:val="left"/>
+      </w:pPr>
+      <w:r>
+        <w:rPr>
+          <w:rFonts w:ascii="Segoe UI" w:hAnsi="Segoe UI"/>
+          <w:b w:val="0"/>
+          <w:i w:val="0"/>
+          <w:color w:val="1E293B"/>
+          <w:sz w:val="21"/>
+        </w:rPr>
+        <w:t>1. Append-Only Immutability: Audit log records are strictly append-only. No user, administrator, or API caller can delete or modify past audit events.</w:t>
+      </w:r>
+    </w:p>
+    <w:p>
+      <w:pPr>
+        <w:spacing w:before="0" w:after="120" w:line="276" w:lineRule="auto"/>
+        <w:jc w:val="left"/>
+      </w:pPr>
+      <w:r>
+        <w:rPr>
+          <w:rFonts w:ascii="Segoe UI" w:hAnsi="Segoe UI"/>
+          <w:b w:val="0"/>
+          <w:i w:val="0"/>
+          <w:color w:val="1E293B"/>
+          <w:sz w:val="21"/>
+        </w:rPr>
+        <w:t>2. Cryptographic Hash Chaining: Each event is cryptographically linked to its predecessor via an SHA-256 digital fingerprint calculated as: SHA256(prev_hash + tenant_id + actor + event_type + object_type + object_id + timestamp + before_payload + after_payload). Sequential chain validation (POST /api/audit/verify-chain) mathematically proves historical data integrity.</w:t>
+      </w:r>
+    </w:p>
+    <w:p>
+      <w:pPr>
+        <w:spacing w:before="0" w:after="120" w:line="276" w:lineRule="auto"/>
+        <w:jc w:val="left"/>
+      </w:pPr>
+      <w:r>
+        <w:rPr>
+          <w:rFonts w:ascii="Segoe UI" w:hAnsi="Segoe UI"/>
+          <w:b w:val="0"/>
+          <w:i w:val="0"/>
+          <w:color w:val="1E293B"/>
+          <w:sz w:val="21"/>
+        </w:rPr>
+        <w:t>3. Sensitive Data Redaction: Passwords, tokens, secret keys, bank secrets, and credential hashes are intercepted and permanently redacted as [REDACTED_SENSITIVE] before rendering in diff views.</w:t>
+      </w:r>
+    </w:p>
+    <w:p>
+      <w:pPr>
+        <w:spacing w:before="0" w:after="120" w:line="276" w:lineRule="auto"/>
+        <w:jc w:val="left"/>
+      </w:pPr>
+      <w:r>
+        <w:rPr>
+          <w:rFonts w:ascii="Segoe UI" w:hAnsi="Segoe UI"/>
+          <w:b w:val="0"/>
+          <w:i w:val="0"/>
+          <w:color w:val="1E293B"/>
+          <w:sz w:val="21"/>
+        </w:rPr>
+        <w:t>4. Audit of Audit: Any administrative inspection, legal hold placement, retention policy update, or evidence export automatically records its own immutable audit event.</w:t>
+      </w:r>
+    </w:p>
+    <w:p>
+      <w:pPr>
+        <w:keepNext/>
+        <w:spacing w:before="280" w:after="120"/>
+      </w:pPr>
+      <w:r>
+        <w:rPr>
+          <w:rFonts w:ascii="Segoe UI" w:hAnsi="Segoe UI"/>
+          <w:b/>
+          <w:i w:val="0"/>
+          <w:color w:val="2D6A4F"/>
+          <w:sz w:val="27"/>
+        </w:rPr>
+        <w:t>11.2 Cockpits, Drawers &amp; Governance Features</w:t>
+      </w:r>
+    </w:p>
+    <w:p>
+      <w:pPr>
+        <w:spacing w:before="0" w:after="120" w:line="276" w:lineRule="auto"/>
+        <w:jc w:val="left"/>
+      </w:pPr>
+      <w:r>
+        <w:rPr>
+          <w:rFonts w:ascii="Segoe UI" w:hAnsi="Segoe UI"/>
+          <w:b w:val="0"/>
+          <w:i w:val="0"/>
+          <w:color w:val="1E293B"/>
+          <w:sz w:val="21"/>
+        </w:rPr>
+        <w:t>• Unified Audit Explorer (/audit): Multidimensional search (Ctrl+F) with module filters, event type filters, timeline table, and 1-click cryptographic chain verification button (#btn-verify-chain).</w:t>
+      </w:r>
+    </w:p>
+    <w:p>
+      <w:pPr>
+        <w:spacing w:before="0" w:after="120" w:line="276" w:lineRule="auto"/>
+        <w:jc w:val="left"/>
+      </w:pPr>
+      <w:r>
+        <w:rPr>
+          <w:rFonts w:ascii="Segoe UI" w:hAnsi="Segoe UI"/>
+          <w:b w:val="0"/>
+          <w:i w:val="0"/>
+          <w:color w:val="1E293B"/>
+          <w:sz w:val="21"/>
+        </w:rPr>
+        <w:t>• Slide-Over Change Detail Drawer: Side inspection panel displaying full event metadata, field-by-field before/after diffs, and an authentic SHA-256 seal badge (✓ SEAL VALID (SHA-256)).</w:t>
+      </w:r>
+    </w:p>
+    <w:p>
+      <w:pPr>
+        <w:spacing w:before="0" w:after="120" w:line="276" w:lineRule="auto"/>
+        <w:jc w:val="left"/>
+      </w:pPr>
+      <w:r>
+        <w:rPr>
+          <w:rFonts w:ascii="Segoe UI" w:hAnsi="Segoe UI"/>
+          <w:b w:val="0"/>
+          <w:i w:val="0"/>
+          <w:color w:val="1E293B"/>
+          <w:sz w:val="21"/>
+        </w:rPr>
+        <w:t>• Data Governance Console (/audit/governance): 4-tab control center covering Statutory Retention Policies (MCA/GST 8-year standard / 2,920 days), Legal Litigation Holds (#btn-apply-hold with freeze &amp; unfreeze reasons), Forensic Anomaly Signals (mass edits, repeated reversals, after-hours modifications, chain integrity), and Auditor Evidence Pack Generation.</w:t>
+      </w:r>
+    </w:p>
+    <w:p>
+      <w:pPr>
+        <w:keepNext/>
+        <w:spacing w:before="360" w:after="160"/>
+      </w:pPr>
+      <w:r>
+        <w:rPr>
+          <w:rFonts w:ascii="Segoe UI" w:hAnsi="Segoe UI"/>
+          <w:b/>
+          <w:i w:val="0"/>
+          <w:color w:val="1B4332"/>
+          <w:sz w:val="36"/>
+        </w:rPr>
+        <w:t>12. Relational Database Schema Dictionary (PostgreSQL)</w:t>
+      </w:r>
+    </w:p>
+    <w:p>
+      <w:pPr>
+        <w:spacing w:before="0" w:after="120" w:line="276" w:lineRule="auto"/>
+        <w:jc w:val="left"/>
+      </w:pPr>
+      <w:r>
+        <w:rPr>
+          <w:rFonts w:ascii="Segoe UI" w:hAnsi="Segoe UI"/>
+          <w:b w:val="0"/>
+          <w:i w:val="0"/>
+          <w:color w:val="1E293B"/>
+          <w:sz w:val="21"/>
+        </w:rPr>
+        <w:t>The database architecture encompasses 21+ high-performance relational tables:</w:t>
       </w:r>
     </w:p>
     <w:tbl>
@@ -6841,6 +7017,255 @@
           </w:p>
         </w:tc>
       </w:tr>
+      <w:tr>
+        <w:tc>
+          <w:tcPr>
+            <w:tcW w:type="dxa" w:w="2160"/>
+            <w:shd w:fill="FFFFFF"/>
+            <w:tcMar>
+              <w:top w:w="100" w:type="dxa"/>
+              <w:bottom w:w="100" w:type="dxa"/>
+              <w:left w:w="150" w:type="dxa"/>
+              <w:right w:w="150" w:type="dxa"/>
+            </w:tcMar>
+          </w:tcPr>
+          <w:p>
+            <w:pPr>
+              <w:jc w:val="left"/>
+            </w:pPr>
+            <w:r>
+              <w:rPr>
+                <w:rFonts w:ascii="Segoe UI" w:hAnsi="Segoe UI"/>
+                <w:b w:val="0"/>
+                <w:i w:val="0"/>
+                <w:color w:val="1E293B"/>
+                <w:sz w:val="18"/>
+              </w:rPr>
+              <w:t>audit_events</w:t>
+            </w:r>
+          </w:p>
+        </w:tc>
+        <w:tc>
+          <w:tcPr>
+            <w:tcW w:type="dxa" w:w="2880"/>
+            <w:shd w:fill="FFFFFF"/>
+            <w:tcMar>
+              <w:top w:w="100" w:type="dxa"/>
+              <w:bottom w:w="100" w:type="dxa"/>
+              <w:left w:w="150" w:type="dxa"/>
+              <w:right w:w="150" w:type="dxa"/>
+            </w:tcMar>
+          </w:tcPr>
+          <w:p>
+            <w:pPr>
+              <w:jc w:val="left"/>
+            </w:pPr>
+            <w:r>
+              <w:rPr>
+                <w:rFonts w:ascii="Segoe UI" w:hAnsi="Segoe UI"/>
+                <w:b w:val="0"/>
+                <w:i w:val="0"/>
+                <w:color w:val="1E293B"/>
+                <w:sz w:val="18"/>
+              </w:rPr>
+              <w:t>id UUID (PK), prev_hash VARCHAR(64)</w:t>
+            </w:r>
+          </w:p>
+        </w:tc>
+        <w:tc>
+          <w:tcPr>
+            <w:tcW w:type="dxa" w:w="4320"/>
+            <w:shd w:fill="FFFFFF"/>
+            <w:tcMar>
+              <w:top w:w="100" w:type="dxa"/>
+              <w:bottom w:w="100" w:type="dxa"/>
+              <w:left w:w="150" w:type="dxa"/>
+              <w:right w:w="150" w:type="dxa"/>
+            </w:tcMar>
+          </w:tcPr>
+          <w:p>
+            <w:pPr>
+              <w:jc w:val="left"/>
+            </w:pPr>
+            <w:r>
+              <w:rPr>
+                <w:rFonts w:ascii="Segoe UI" w:hAnsi="Segoe UI"/>
+                <w:b w:val="0"/>
+                <w:i w:val="0"/>
+                <w:color w:val="1E293B"/>
+                <w:sz w:val="18"/>
+              </w:rPr>
+              <w:t>Immutable cryptographically chained audit events. Columns: company_id, actor_name, event_type, object_type, before_payload JSONB, after_payload JSONB, event_hash.</w:t>
+            </w:r>
+          </w:p>
+        </w:tc>
+      </w:tr>
+      <w:tr>
+        <w:tc>
+          <w:tcPr>
+            <w:tcW w:type="dxa" w:w="2160"/>
+            <w:shd w:fill="F8FAF9"/>
+            <w:tcMar>
+              <w:top w:w="100" w:type="dxa"/>
+              <w:bottom w:w="100" w:type="dxa"/>
+              <w:left w:w="150" w:type="dxa"/>
+              <w:right w:w="150" w:type="dxa"/>
+            </w:tcMar>
+          </w:tcPr>
+          <w:p>
+            <w:pPr>
+              <w:jc w:val="left"/>
+            </w:pPr>
+            <w:r>
+              <w:rPr>
+                <w:rFonts w:ascii="Segoe UI" w:hAnsi="Segoe UI"/>
+                <w:b w:val="0"/>
+                <w:i w:val="0"/>
+                <w:color w:val="1E293B"/>
+                <w:sz w:val="18"/>
+              </w:rPr>
+              <w:t>retention_policies</w:t>
+            </w:r>
+          </w:p>
+        </w:tc>
+        <w:tc>
+          <w:tcPr>
+            <w:tcW w:type="dxa" w:w="2880"/>
+            <w:shd w:fill="F8FAF9"/>
+            <w:tcMar>
+              <w:top w:w="100" w:type="dxa"/>
+              <w:bottom w:w="100" w:type="dxa"/>
+              <w:left w:w="150" w:type="dxa"/>
+              <w:right w:w="150" w:type="dxa"/>
+            </w:tcMar>
+          </w:tcPr>
+          <w:p>
+            <w:pPr>
+              <w:jc w:val="left"/>
+            </w:pPr>
+            <w:r>
+              <w:rPr>
+                <w:rFonts w:ascii="Segoe UI" w:hAnsi="Segoe UI"/>
+                <w:b w:val="0"/>
+                <w:i w:val="0"/>
+                <w:color w:val="1E293B"/>
+                <w:sz w:val="18"/>
+              </w:rPr>
+              <w:t>id UUID (PK), company_id (FK)</w:t>
+            </w:r>
+          </w:p>
+        </w:tc>
+        <w:tc>
+          <w:tcPr>
+            <w:tcW w:type="dxa" w:w="4320"/>
+            <w:shd w:fill="F8FAF9"/>
+            <w:tcMar>
+              <w:top w:w="100" w:type="dxa"/>
+              <w:bottom w:w="100" w:type="dxa"/>
+              <w:left w:w="150" w:type="dxa"/>
+              <w:right w:w="150" w:type="dxa"/>
+            </w:tcMar>
+          </w:tcPr>
+          <w:p>
+            <w:pPr>
+              <w:jc w:val="left"/>
+            </w:pPr>
+            <w:r>
+              <w:rPr>
+                <w:rFonts w:ascii="Segoe UI" w:hAnsi="Segoe UI"/>
+                <w:b w:val="0"/>
+                <w:i w:val="0"/>
+                <w:color w:val="1E293B"/>
+                <w:sz w:val="18"/>
+              </w:rPr>
+              <w:t>Statutory retention policies. Columns: object_type, retention_days (2920 days / 8 yrs), legal_hold_allowed, effective_from.</w:t>
+            </w:r>
+          </w:p>
+        </w:tc>
+      </w:tr>
+      <w:tr>
+        <w:tc>
+          <w:tcPr>
+            <w:tcW w:type="dxa" w:w="2160"/>
+            <w:shd w:fill="FFFFFF"/>
+            <w:tcMar>
+              <w:top w:w="100" w:type="dxa"/>
+              <w:bottom w:w="100" w:type="dxa"/>
+              <w:left w:w="150" w:type="dxa"/>
+              <w:right w:w="150" w:type="dxa"/>
+            </w:tcMar>
+          </w:tcPr>
+          <w:p>
+            <w:pPr>
+              <w:jc w:val="left"/>
+            </w:pPr>
+            <w:r>
+              <w:rPr>
+                <w:rFonts w:ascii="Segoe UI" w:hAnsi="Segoe UI"/>
+                <w:b w:val="0"/>
+                <w:i w:val="0"/>
+                <w:color w:val="1E293B"/>
+                <w:sz w:val="18"/>
+              </w:rPr>
+              <w:t>legal_holds</w:t>
+            </w:r>
+          </w:p>
+        </w:tc>
+        <w:tc>
+          <w:tcPr>
+            <w:tcW w:type="dxa" w:w="2880"/>
+            <w:shd w:fill="FFFFFF"/>
+            <w:tcMar>
+              <w:top w:w="100" w:type="dxa"/>
+              <w:bottom w:w="100" w:type="dxa"/>
+              <w:left w:w="150" w:type="dxa"/>
+              <w:right w:w="150" w:type="dxa"/>
+            </w:tcMar>
+          </w:tcPr>
+          <w:p>
+            <w:pPr>
+              <w:jc w:val="left"/>
+            </w:pPr>
+            <w:r>
+              <w:rPr>
+                <w:rFonts w:ascii="Segoe UI" w:hAnsi="Segoe UI"/>
+                <w:b w:val="0"/>
+                <w:i w:val="0"/>
+                <w:color w:val="1E293B"/>
+                <w:sz w:val="18"/>
+              </w:rPr>
+              <w:t>id UUID (PK), company_id (FK)</w:t>
+            </w:r>
+          </w:p>
+        </w:tc>
+        <w:tc>
+          <w:tcPr>
+            <w:tcW w:type="dxa" w:w="4320"/>
+            <w:shd w:fill="FFFFFF"/>
+            <w:tcMar>
+              <w:top w:w="100" w:type="dxa"/>
+              <w:bottom w:w="100" w:type="dxa"/>
+              <w:left w:w="150" w:type="dxa"/>
+              <w:right w:w="150" w:type="dxa"/>
+            </w:tcMar>
+          </w:tcPr>
+          <w:p>
+            <w:pPr>
+              <w:jc w:val="left"/>
+            </w:pPr>
+            <w:r>
+              <w:rPr>
+                <w:rFonts w:ascii="Segoe UI" w:hAnsi="Segoe UI"/>
+                <w:b w:val="0"/>
+                <w:i w:val="0"/>
+                <w:color w:val="1E293B"/>
+                <w:sz w:val="18"/>
+              </w:rPr>
+              <w:t>Statutory litigation/inquiry holds. Columns: scope_type, scope_description, reason, created_by_id, released_at, release_reason.</w:t>
+            </w:r>
+          </w:p>
+        </w:tc>
+      </w:tr>
     </w:tbl>
     <w:p>
       <w:pPr>
@@ -6860,7 +7285,7 @@
           <w:color w:val="1B4332"/>
           <w:sz w:val="36"/>
         </w:rPr>
-        <w:t>12. RESTful API Directory &amp; Endpoint Specifications</w:t>
+        <w:t>13. RESTful API Directory &amp; Endpoint Specifications</w:t>
       </w:r>
     </w:p>
     <w:p>
@@ -8882,6 +9307,670 @@
           </w:p>
         </w:tc>
       </w:tr>
+      <w:tr>
+        <w:tc>
+          <w:tcPr>
+            <w:tcW w:type="dxa" w:w="3168"/>
+            <w:shd w:fill="F8FAF9"/>
+            <w:tcMar>
+              <w:top w:w="100" w:type="dxa"/>
+              <w:bottom w:w="100" w:type="dxa"/>
+              <w:left w:w="150" w:type="dxa"/>
+              <w:right w:w="150" w:type="dxa"/>
+            </w:tcMar>
+          </w:tcPr>
+          <w:p>
+            <w:pPr>
+              <w:jc w:val="left"/>
+            </w:pPr>
+            <w:r>
+              <w:rPr>
+                <w:rFonts w:ascii="Segoe UI" w:hAnsi="Segoe UI"/>
+                <w:b w:val="0"/>
+                <w:i w:val="0"/>
+                <w:color w:val="1E293B"/>
+                <w:sz w:val="18"/>
+              </w:rPr>
+              <w:t>/api/audit/events</w:t>
+            </w:r>
+          </w:p>
+        </w:tc>
+        <w:tc>
+          <w:tcPr>
+            <w:tcW w:type="dxa" w:w="1296"/>
+            <w:shd w:fill="F8FAF9"/>
+            <w:tcMar>
+              <w:top w:w="100" w:type="dxa"/>
+              <w:bottom w:w="100" w:type="dxa"/>
+              <w:left w:w="150" w:type="dxa"/>
+              <w:right w:w="150" w:type="dxa"/>
+            </w:tcMar>
+          </w:tcPr>
+          <w:p>
+            <w:pPr>
+              <w:jc w:val="left"/>
+            </w:pPr>
+            <w:r>
+              <w:rPr>
+                <w:rFonts w:ascii="Segoe UI" w:hAnsi="Segoe UI"/>
+                <w:b w:val="0"/>
+                <w:i w:val="0"/>
+                <w:color w:val="1E293B"/>
+                <w:sz w:val="18"/>
+              </w:rPr>
+              <w:t>GET</w:t>
+            </w:r>
+          </w:p>
+        </w:tc>
+        <w:tc>
+          <w:tcPr>
+            <w:tcW w:type="dxa" w:w="4896"/>
+            <w:shd w:fill="F8FAF9"/>
+            <w:tcMar>
+              <w:top w:w="100" w:type="dxa"/>
+              <w:bottom w:w="100" w:type="dxa"/>
+              <w:left w:w="150" w:type="dxa"/>
+              <w:right w:w="150" w:type="dxa"/>
+            </w:tcMar>
+          </w:tcPr>
+          <w:p>
+            <w:pPr>
+              <w:jc w:val="left"/>
+            </w:pPr>
+            <w:r>
+              <w:rPr>
+                <w:rFonts w:ascii="Segoe UI" w:hAnsi="Segoe UI"/>
+                <w:b w:val="0"/>
+                <w:i w:val="0"/>
+                <w:color w:val="1E293B"/>
+                <w:sz w:val="18"/>
+              </w:rPr>
+              <w:t>Multidimensional audit event query with module/event filtering and pagination.</w:t>
+            </w:r>
+          </w:p>
+        </w:tc>
+      </w:tr>
+      <w:tr>
+        <w:tc>
+          <w:tcPr>
+            <w:tcW w:type="dxa" w:w="3168"/>
+            <w:shd w:fill="FFFFFF"/>
+            <w:tcMar>
+              <w:top w:w="100" w:type="dxa"/>
+              <w:bottom w:w="100" w:type="dxa"/>
+              <w:left w:w="150" w:type="dxa"/>
+              <w:right w:w="150" w:type="dxa"/>
+            </w:tcMar>
+          </w:tcPr>
+          <w:p>
+            <w:pPr>
+              <w:jc w:val="left"/>
+            </w:pPr>
+            <w:r>
+              <w:rPr>
+                <w:rFonts w:ascii="Segoe UI" w:hAnsi="Segoe UI"/>
+                <w:b w:val="0"/>
+                <w:i w:val="0"/>
+                <w:color w:val="1E293B"/>
+                <w:sz w:val="18"/>
+              </w:rPr>
+              <w:t>/api/audit/diff/{id}</w:t>
+            </w:r>
+          </w:p>
+        </w:tc>
+        <w:tc>
+          <w:tcPr>
+            <w:tcW w:type="dxa" w:w="1296"/>
+            <w:shd w:fill="FFFFFF"/>
+            <w:tcMar>
+              <w:top w:w="100" w:type="dxa"/>
+              <w:bottom w:w="100" w:type="dxa"/>
+              <w:left w:w="150" w:type="dxa"/>
+              <w:right w:w="150" w:type="dxa"/>
+            </w:tcMar>
+          </w:tcPr>
+          <w:p>
+            <w:pPr>
+              <w:jc w:val="left"/>
+            </w:pPr>
+            <w:r>
+              <w:rPr>
+                <w:rFonts w:ascii="Segoe UI" w:hAnsi="Segoe UI"/>
+                <w:b w:val="0"/>
+                <w:i w:val="0"/>
+                <w:color w:val="1E293B"/>
+                <w:sz w:val="18"/>
+              </w:rPr>
+              <w:t>GET</w:t>
+            </w:r>
+          </w:p>
+        </w:tc>
+        <w:tc>
+          <w:tcPr>
+            <w:tcW w:type="dxa" w:w="4896"/>
+            <w:shd w:fill="FFFFFF"/>
+            <w:tcMar>
+              <w:top w:w="100" w:type="dxa"/>
+              <w:bottom w:w="100" w:type="dxa"/>
+              <w:left w:w="150" w:type="dxa"/>
+              <w:right w:w="150" w:type="dxa"/>
+            </w:tcMar>
+          </w:tcPr>
+          <w:p>
+            <w:pPr>
+              <w:jc w:val="left"/>
+            </w:pPr>
+            <w:r>
+              <w:rPr>
+                <w:rFonts w:ascii="Segoe UI" w:hAnsi="Segoe UI"/>
+                <w:b w:val="0"/>
+                <w:i w:val="0"/>
+                <w:color w:val="1E293B"/>
+                <w:sz w:val="18"/>
+              </w:rPr>
+              <w:t>Field-by-field before/after state diff with sensitive data masking and hash seal test.</w:t>
+            </w:r>
+          </w:p>
+        </w:tc>
+      </w:tr>
+      <w:tr>
+        <w:tc>
+          <w:tcPr>
+            <w:tcW w:type="dxa" w:w="3168"/>
+            <w:shd w:fill="F8FAF9"/>
+            <w:tcMar>
+              <w:top w:w="100" w:type="dxa"/>
+              <w:bottom w:w="100" w:type="dxa"/>
+              <w:left w:w="150" w:type="dxa"/>
+              <w:right w:w="150" w:type="dxa"/>
+            </w:tcMar>
+          </w:tcPr>
+          <w:p>
+            <w:pPr>
+              <w:jc w:val="left"/>
+            </w:pPr>
+            <w:r>
+              <w:rPr>
+                <w:rFonts w:ascii="Segoe UI" w:hAnsi="Segoe UI"/>
+                <w:b w:val="0"/>
+                <w:i w:val="0"/>
+                <w:color w:val="1E293B"/>
+                <w:sz w:val="18"/>
+              </w:rPr>
+              <w:t>/api/audit/verify-chain</w:t>
+            </w:r>
+          </w:p>
+        </w:tc>
+        <w:tc>
+          <w:tcPr>
+            <w:tcW w:type="dxa" w:w="1296"/>
+            <w:shd w:fill="F8FAF9"/>
+            <w:tcMar>
+              <w:top w:w="100" w:type="dxa"/>
+              <w:bottom w:w="100" w:type="dxa"/>
+              <w:left w:w="150" w:type="dxa"/>
+              <w:right w:w="150" w:type="dxa"/>
+            </w:tcMar>
+          </w:tcPr>
+          <w:p>
+            <w:pPr>
+              <w:jc w:val="left"/>
+            </w:pPr>
+            <w:r>
+              <w:rPr>
+                <w:rFonts w:ascii="Segoe UI" w:hAnsi="Segoe UI"/>
+                <w:b w:val="0"/>
+                <w:i w:val="0"/>
+                <w:color w:val="1E293B"/>
+                <w:sz w:val="18"/>
+              </w:rPr>
+              <w:t>POST</w:t>
+            </w:r>
+          </w:p>
+        </w:tc>
+        <w:tc>
+          <w:tcPr>
+            <w:tcW w:type="dxa" w:w="4896"/>
+            <w:shd w:fill="F8FAF9"/>
+            <w:tcMar>
+              <w:top w:w="100" w:type="dxa"/>
+              <w:bottom w:w="100" w:type="dxa"/>
+              <w:left w:w="150" w:type="dxa"/>
+              <w:right w:w="150" w:type="dxa"/>
+            </w:tcMar>
+          </w:tcPr>
+          <w:p>
+            <w:pPr>
+              <w:jc w:val="left"/>
+            </w:pPr>
+            <w:r>
+              <w:rPr>
+                <w:rFonts w:ascii="Segoe UI" w:hAnsi="Segoe UI"/>
+                <w:b w:val="0"/>
+                <w:i w:val="0"/>
+                <w:color w:val="1E293B"/>
+                <w:sz w:val="18"/>
+              </w:rPr>
+              <w:t>Traverses sequential SHA-256 cryptographic chain certifying 100% data integrity.</w:t>
+            </w:r>
+          </w:p>
+        </w:tc>
+      </w:tr>
+      <w:tr>
+        <w:tc>
+          <w:tcPr>
+            <w:tcW w:type="dxa" w:w="3168"/>
+            <w:shd w:fill="FFFFFF"/>
+            <w:tcMar>
+              <w:top w:w="100" w:type="dxa"/>
+              <w:bottom w:w="100" w:type="dxa"/>
+              <w:left w:w="150" w:type="dxa"/>
+              <w:right w:w="150" w:type="dxa"/>
+            </w:tcMar>
+          </w:tcPr>
+          <w:p>
+            <w:pPr>
+              <w:jc w:val="left"/>
+            </w:pPr>
+            <w:r>
+              <w:rPr>
+                <w:rFonts w:ascii="Segoe UI" w:hAnsi="Segoe UI"/>
+                <w:b w:val="0"/>
+                <w:i w:val="0"/>
+                <w:color w:val="1E293B"/>
+                <w:sz w:val="18"/>
+              </w:rPr>
+              <w:t>/api/audit/retention/policies</w:t>
+            </w:r>
+          </w:p>
+        </w:tc>
+        <w:tc>
+          <w:tcPr>
+            <w:tcW w:type="dxa" w:w="1296"/>
+            <w:shd w:fill="FFFFFF"/>
+            <w:tcMar>
+              <w:top w:w="100" w:type="dxa"/>
+              <w:bottom w:w="100" w:type="dxa"/>
+              <w:left w:w="150" w:type="dxa"/>
+              <w:right w:w="150" w:type="dxa"/>
+            </w:tcMar>
+          </w:tcPr>
+          <w:p>
+            <w:pPr>
+              <w:jc w:val="left"/>
+            </w:pPr>
+            <w:r>
+              <w:rPr>
+                <w:rFonts w:ascii="Segoe UI" w:hAnsi="Segoe UI"/>
+                <w:b w:val="0"/>
+                <w:i w:val="0"/>
+                <w:color w:val="1E293B"/>
+                <w:sz w:val="18"/>
+              </w:rPr>
+              <w:t>GET / POST</w:t>
+            </w:r>
+          </w:p>
+        </w:tc>
+        <w:tc>
+          <w:tcPr>
+            <w:tcW w:type="dxa" w:w="4896"/>
+            <w:shd w:fill="FFFFFF"/>
+            <w:tcMar>
+              <w:top w:w="100" w:type="dxa"/>
+              <w:bottom w:w="100" w:type="dxa"/>
+              <w:left w:w="150" w:type="dxa"/>
+              <w:right w:w="150" w:type="dxa"/>
+            </w:tcMar>
+          </w:tcPr>
+          <w:p>
+            <w:pPr>
+              <w:jc w:val="left"/>
+            </w:pPr>
+            <w:r>
+              <w:rPr>
+                <w:rFonts w:ascii="Segoe UI" w:hAnsi="Segoe UI"/>
+                <w:b w:val="0"/>
+                <w:i w:val="0"/>
+                <w:color w:val="1E293B"/>
+                <w:sz w:val="18"/>
+              </w:rPr>
+              <w:t>Retrieves and upserts statutory retention schedules (MCA/GST 8-year standard).</w:t>
+            </w:r>
+          </w:p>
+        </w:tc>
+      </w:tr>
+      <w:tr>
+        <w:tc>
+          <w:tcPr>
+            <w:tcW w:type="dxa" w:w="3168"/>
+            <w:shd w:fill="F8FAF9"/>
+            <w:tcMar>
+              <w:top w:w="100" w:type="dxa"/>
+              <w:bottom w:w="100" w:type="dxa"/>
+              <w:left w:w="150" w:type="dxa"/>
+              <w:right w:w="150" w:type="dxa"/>
+            </w:tcMar>
+          </w:tcPr>
+          <w:p>
+            <w:pPr>
+              <w:jc w:val="left"/>
+            </w:pPr>
+            <w:r>
+              <w:rPr>
+                <w:rFonts w:ascii="Segoe UI" w:hAnsi="Segoe UI"/>
+                <w:b w:val="0"/>
+                <w:i w:val="0"/>
+                <w:color w:val="1E293B"/>
+                <w:sz w:val="18"/>
+              </w:rPr>
+              <w:t>/api/audit/legal-holds</w:t>
+            </w:r>
+          </w:p>
+        </w:tc>
+        <w:tc>
+          <w:tcPr>
+            <w:tcW w:type="dxa" w:w="1296"/>
+            <w:shd w:fill="F8FAF9"/>
+            <w:tcMar>
+              <w:top w:w="100" w:type="dxa"/>
+              <w:bottom w:w="100" w:type="dxa"/>
+              <w:left w:w="150" w:type="dxa"/>
+              <w:right w:w="150" w:type="dxa"/>
+            </w:tcMar>
+          </w:tcPr>
+          <w:p>
+            <w:pPr>
+              <w:jc w:val="left"/>
+            </w:pPr>
+            <w:r>
+              <w:rPr>
+                <w:rFonts w:ascii="Segoe UI" w:hAnsi="Segoe UI"/>
+                <w:b w:val="0"/>
+                <w:i w:val="0"/>
+                <w:color w:val="1E293B"/>
+                <w:sz w:val="18"/>
+              </w:rPr>
+              <w:t>GET / POST</w:t>
+            </w:r>
+          </w:p>
+        </w:tc>
+        <w:tc>
+          <w:tcPr>
+            <w:tcW w:type="dxa" w:w="4896"/>
+            <w:shd w:fill="F8FAF9"/>
+            <w:tcMar>
+              <w:top w:w="100" w:type="dxa"/>
+              <w:bottom w:w="100" w:type="dxa"/>
+              <w:left w:w="150" w:type="dxa"/>
+              <w:right w:w="150" w:type="dxa"/>
+            </w:tcMar>
+          </w:tcPr>
+          <w:p>
+            <w:pPr>
+              <w:jc w:val="left"/>
+            </w:pPr>
+            <w:r>
+              <w:rPr>
+                <w:rFonts w:ascii="Segoe UI" w:hAnsi="Segoe UI"/>
+                <w:b w:val="0"/>
+                <w:i w:val="0"/>
+                <w:color w:val="1E293B"/>
+                <w:sz w:val="18"/>
+              </w:rPr>
+              <w:t>Applies and lists statutory inquiry/litigation holds freezing records.</w:t>
+            </w:r>
+          </w:p>
+        </w:tc>
+      </w:tr>
+      <w:tr>
+        <w:tc>
+          <w:tcPr>
+            <w:tcW w:type="dxa" w:w="3168"/>
+            <w:shd w:fill="FFFFFF"/>
+            <w:tcMar>
+              <w:top w:w="100" w:type="dxa"/>
+              <w:bottom w:w="100" w:type="dxa"/>
+              <w:left w:w="150" w:type="dxa"/>
+              <w:right w:w="150" w:type="dxa"/>
+            </w:tcMar>
+          </w:tcPr>
+          <w:p>
+            <w:pPr>
+              <w:jc w:val="left"/>
+            </w:pPr>
+            <w:r>
+              <w:rPr>
+                <w:rFonts w:ascii="Segoe UI" w:hAnsi="Segoe UI"/>
+                <w:b w:val="0"/>
+                <w:i w:val="0"/>
+                <w:color w:val="1E293B"/>
+                <w:sz w:val="18"/>
+              </w:rPr>
+              <w:t>/api/audit/legal-holds/{id}/release</w:t>
+            </w:r>
+          </w:p>
+        </w:tc>
+        <w:tc>
+          <w:tcPr>
+            <w:tcW w:type="dxa" w:w="1296"/>
+            <w:shd w:fill="FFFFFF"/>
+            <w:tcMar>
+              <w:top w:w="100" w:type="dxa"/>
+              <w:bottom w:w="100" w:type="dxa"/>
+              <w:left w:w="150" w:type="dxa"/>
+              <w:right w:w="150" w:type="dxa"/>
+            </w:tcMar>
+          </w:tcPr>
+          <w:p>
+            <w:pPr>
+              <w:jc w:val="left"/>
+            </w:pPr>
+            <w:r>
+              <w:rPr>
+                <w:rFonts w:ascii="Segoe UI" w:hAnsi="Segoe UI"/>
+                <w:b w:val="0"/>
+                <w:i w:val="0"/>
+                <w:color w:val="1E293B"/>
+                <w:sz w:val="18"/>
+              </w:rPr>
+              <w:t>POST</w:t>
+            </w:r>
+          </w:p>
+        </w:tc>
+        <w:tc>
+          <w:tcPr>
+            <w:tcW w:type="dxa" w:w="4896"/>
+            <w:shd w:fill="FFFFFF"/>
+            <w:tcMar>
+              <w:top w:w="100" w:type="dxa"/>
+              <w:bottom w:w="100" w:type="dxa"/>
+              <w:left w:w="150" w:type="dxa"/>
+              <w:right w:w="150" w:type="dxa"/>
+            </w:tcMar>
+          </w:tcPr>
+          <w:p>
+            <w:pPr>
+              <w:jc w:val="left"/>
+            </w:pPr>
+            <w:r>
+              <w:rPr>
+                <w:rFonts w:ascii="Segoe UI" w:hAnsi="Segoe UI"/>
+                <w:b w:val="0"/>
+                <w:i w:val="0"/>
+                <w:color w:val="1E293B"/>
+                <w:sz w:val="18"/>
+              </w:rPr>
+              <w:t>Releases legal hold with mandatory justification audit reason.</w:t>
+            </w:r>
+          </w:p>
+        </w:tc>
+      </w:tr>
+      <w:tr>
+        <w:tc>
+          <w:tcPr>
+            <w:tcW w:type="dxa" w:w="3168"/>
+            <w:shd w:fill="F8FAF9"/>
+            <w:tcMar>
+              <w:top w:w="100" w:type="dxa"/>
+              <w:bottom w:w="100" w:type="dxa"/>
+              <w:left w:w="150" w:type="dxa"/>
+              <w:right w:w="150" w:type="dxa"/>
+            </w:tcMar>
+          </w:tcPr>
+          <w:p>
+            <w:pPr>
+              <w:jc w:val="left"/>
+            </w:pPr>
+            <w:r>
+              <w:rPr>
+                <w:rFonts w:ascii="Segoe UI" w:hAnsi="Segoe UI"/>
+                <w:b w:val="0"/>
+                <w:i w:val="0"/>
+                <w:color w:val="1E293B"/>
+                <w:sz w:val="18"/>
+              </w:rPr>
+              <w:t>/api/audit/anomalies</w:t>
+            </w:r>
+          </w:p>
+        </w:tc>
+        <w:tc>
+          <w:tcPr>
+            <w:tcW w:type="dxa" w:w="1296"/>
+            <w:shd w:fill="F8FAF9"/>
+            <w:tcMar>
+              <w:top w:w="100" w:type="dxa"/>
+              <w:bottom w:w="100" w:type="dxa"/>
+              <w:left w:w="150" w:type="dxa"/>
+              <w:right w:w="150" w:type="dxa"/>
+            </w:tcMar>
+          </w:tcPr>
+          <w:p>
+            <w:pPr>
+              <w:jc w:val="left"/>
+            </w:pPr>
+            <w:r>
+              <w:rPr>
+                <w:rFonts w:ascii="Segoe UI" w:hAnsi="Segoe UI"/>
+                <w:b w:val="0"/>
+                <w:i w:val="0"/>
+                <w:color w:val="1E293B"/>
+                <w:sz w:val="18"/>
+              </w:rPr>
+              <w:t>GET</w:t>
+            </w:r>
+          </w:p>
+        </w:tc>
+        <w:tc>
+          <w:tcPr>
+            <w:tcW w:type="dxa" w:w="4896"/>
+            <w:shd w:fill="F8FAF9"/>
+            <w:tcMar>
+              <w:top w:w="100" w:type="dxa"/>
+              <w:bottom w:w="100" w:type="dxa"/>
+              <w:left w:w="150" w:type="dxa"/>
+              <w:right w:w="150" w:type="dxa"/>
+            </w:tcMar>
+          </w:tcPr>
+          <w:p>
+            <w:pPr>
+              <w:jc w:val="left"/>
+            </w:pPr>
+            <w:r>
+              <w:rPr>
+                <w:rFonts w:ascii="Segoe UI" w:hAnsi="Segoe UI"/>
+                <w:b w:val="0"/>
+                <w:i w:val="0"/>
+                <w:color w:val="1E293B"/>
+                <w:sz w:val="18"/>
+              </w:rPr>
+              <w:t>Scans for velocity spikes, repeated cancellations, after-hours edits, and chain tampering.</w:t>
+            </w:r>
+          </w:p>
+        </w:tc>
+      </w:tr>
+      <w:tr>
+        <w:tc>
+          <w:tcPr>
+            <w:tcW w:type="dxa" w:w="3168"/>
+            <w:shd w:fill="FFFFFF"/>
+            <w:tcMar>
+              <w:top w:w="100" w:type="dxa"/>
+              <w:bottom w:w="100" w:type="dxa"/>
+              <w:left w:w="150" w:type="dxa"/>
+              <w:right w:w="150" w:type="dxa"/>
+            </w:tcMar>
+          </w:tcPr>
+          <w:p>
+            <w:pPr>
+              <w:jc w:val="left"/>
+            </w:pPr>
+            <w:r>
+              <w:rPr>
+                <w:rFonts w:ascii="Segoe UI" w:hAnsi="Segoe UI"/>
+                <w:b w:val="0"/>
+                <w:i w:val="0"/>
+                <w:color w:val="1E293B"/>
+                <w:sz w:val="18"/>
+              </w:rPr>
+              <w:t>/api/audit/evidence-pack</w:t>
+            </w:r>
+          </w:p>
+        </w:tc>
+        <w:tc>
+          <w:tcPr>
+            <w:tcW w:type="dxa" w:w="1296"/>
+            <w:shd w:fill="FFFFFF"/>
+            <w:tcMar>
+              <w:top w:w="100" w:type="dxa"/>
+              <w:bottom w:w="100" w:type="dxa"/>
+              <w:left w:w="150" w:type="dxa"/>
+              <w:right w:w="150" w:type="dxa"/>
+            </w:tcMar>
+          </w:tcPr>
+          <w:p>
+            <w:pPr>
+              <w:jc w:val="left"/>
+            </w:pPr>
+            <w:r>
+              <w:rPr>
+                <w:rFonts w:ascii="Segoe UI" w:hAnsi="Segoe UI"/>
+                <w:b w:val="0"/>
+                <w:i w:val="0"/>
+                <w:color w:val="1E293B"/>
+                <w:sz w:val="18"/>
+              </w:rPr>
+              <w:t>POST</w:t>
+            </w:r>
+          </w:p>
+        </w:tc>
+        <w:tc>
+          <w:tcPr>
+            <w:tcW w:type="dxa" w:w="4896"/>
+            <w:shd w:fill="FFFFFF"/>
+            <w:tcMar>
+              <w:top w:w="100" w:type="dxa"/>
+              <w:bottom w:w="100" w:type="dxa"/>
+              <w:left w:w="150" w:type="dxa"/>
+              <w:right w:w="150" w:type="dxa"/>
+            </w:tcMar>
+          </w:tcPr>
+          <w:p>
+            <w:pPr>
+              <w:jc w:val="left"/>
+            </w:pPr>
+            <w:r>
+              <w:rPr>
+                <w:rFonts w:ascii="Segoe UI" w:hAnsi="Segoe UI"/>
+                <w:b w:val="0"/>
+                <w:i w:val="0"/>
+                <w:color w:val="1E293B"/>
+                <w:sz w:val="18"/>
+              </w:rPr>
+              <w:t>Produces cryptographically sealed audit evidence package with SHA-256 root hash.</w:t>
+            </w:r>
+          </w:p>
+        </w:tc>
+      </w:tr>
     </w:tbl>
     <w:p>
       <w:pPr>
@@ -8901,7 +9990,7 @@
           <w:color w:val="1B4332"/>
           <w:sz w:val="36"/>
         </w:rPr>
-        <w:t>13. Automated Selenium QA Matrix &amp; Production Deployment</w:t>
+        <w:t>14. Automated Selenium QA Matrix &amp; Production Deployment</w:t>
       </w:r>
     </w:p>
     <w:p>
@@ -9844,6 +10933,89 @@
           </w:p>
         </w:tc>
       </w:tr>
+      <w:tr>
+        <w:tc>
+          <w:tcPr>
+            <w:tcW w:type="dxa" w:w="3312"/>
+            <w:shd w:fill="FFFFFF"/>
+            <w:tcMar>
+              <w:top w:w="100" w:type="dxa"/>
+              <w:bottom w:w="100" w:type="dxa"/>
+              <w:left w:w="150" w:type="dxa"/>
+              <w:right w:w="150" w:type="dxa"/>
+            </w:tcMar>
+          </w:tcPr>
+          <w:p>
+            <w:pPr>
+              <w:jc w:val="left"/>
+            </w:pPr>
+            <w:r>
+              <w:rPr>
+                <w:rFonts w:ascii="Segoe UI" w:hAnsi="Segoe UI"/>
+                <w:b w:val="0"/>
+                <w:i w:val="0"/>
+                <w:color w:val="1E293B"/>
+                <w:sz w:val="18"/>
+              </w:rPr>
+              <w:t>test_audit_governance_selenium.py</w:t>
+            </w:r>
+          </w:p>
+        </w:tc>
+        <w:tc>
+          <w:tcPr>
+            <w:tcW w:type="dxa" w:w="1440"/>
+            <w:shd w:fill="FFFFFF"/>
+            <w:tcMar>
+              <w:top w:w="100" w:type="dxa"/>
+              <w:bottom w:w="100" w:type="dxa"/>
+              <w:left w:w="150" w:type="dxa"/>
+              <w:right w:w="150" w:type="dxa"/>
+            </w:tcMar>
+          </w:tcPr>
+          <w:p>
+            <w:pPr>
+              <w:jc w:val="left"/>
+            </w:pPr>
+            <w:r>
+              <w:rPr>
+                <w:rFonts w:ascii="Segoe UI" w:hAnsi="Segoe UI"/>
+                <w:b w:val="0"/>
+                <w:i w:val="0"/>
+                <w:color w:val="1E293B"/>
+                <w:sz w:val="18"/>
+              </w:rPr>
+              <w:t>10 Stages</w:t>
+            </w:r>
+          </w:p>
+        </w:tc>
+        <w:tc>
+          <w:tcPr>
+            <w:tcW w:type="dxa" w:w="4608"/>
+            <w:shd w:fill="FFFFFF"/>
+            <w:tcMar>
+              <w:top w:w="100" w:type="dxa"/>
+              <w:bottom w:w="100" w:type="dxa"/>
+              <w:left w:w="150" w:type="dxa"/>
+              <w:right w:w="150" w:type="dxa"/>
+            </w:tcMar>
+          </w:tcPr>
+          <w:p>
+            <w:pPr>
+              <w:jc w:val="left"/>
+            </w:pPr>
+            <w:r>
+              <w:rPr>
+                <w:rFonts w:ascii="Segoe UI" w:hAnsi="Segoe UI"/>
+                <w:b w:val="0"/>
+                <w:i w:val="0"/>
+                <w:color w:val="1E293B"/>
+                <w:sz w:val="18"/>
+              </w:rPr>
+              <w:t>100% PASS: Cryptographic SHA-256 hash chaining, diff drawer, seal validation, retention policies, legal holds, forensic anomalies, evidence pack.</w:t>
+            </w:r>
+          </w:p>
+        </w:tc>
+      </w:tr>
     </w:tbl>
     <w:p>
       <w:pPr>
@@ -9863,7 +11035,7 @@
           <w:color w:val="2D6A4F"/>
           <w:sz w:val="27"/>
         </w:rPr>
-        <w:t>13.1 Production Deployment &amp; Synchronization Commands</w:t>
+        <w:t>14.1 Production Deployment &amp; Synchronization Commands</w:t>
       </w:r>
     </w:p>
     <w:p>

</xml_diff>

<commit_message>
feat(DOC-34): Cargo & Consignment Management Engine with Admin-funded cost separation, volumetric CBM, and POD exception desk
</commit_message>
<xml_diff>
--- a/ERP_ENTERPRISE_SYSTEM_COMPLETE_SOFTWARE_MASTER_WALKTHROUGH.docx
+++ b/ERP_ENTERPRISE_SYSTEM_COMPLETE_SOFTWARE_MASTER_WALKTHROUGH.docx
@@ -5410,7 +5410,7 @@
           <w:color w:val="1B4332"/>
           <w:sz w:val="36"/>
         </w:rPr>
-        <w:t>12. Relational Database Schema Dictionary (PostgreSQL)</w:t>
+        <w:t>12. Cargo &amp; Consignment Management Engine (DOC-34)</w:t>
       </w:r>
     </w:p>
     <w:p>
@@ -5426,7 +5426,215 @@
           <w:color w:val="1E293B"/>
           <w:sz w:val="21"/>
         </w:rPr>
-        <w:t>The database architecture encompasses 21+ high-performance relational tables:</w:t>
+        <w:t>DOC-34 governs physical transport logistics, consignment series management, volumetric CBM calculations, carrier chain-of-custody, four-eyes delivery sign-offs, and Admin-funded cargo cost segregation.</w:t>
+      </w:r>
+    </w:p>
+    <w:p>
+      <w:pPr>
+        <w:keepNext/>
+        <w:spacing w:before="280" w:after="120"/>
+      </w:pPr>
+      <w:r>
+        <w:rPr>
+          <w:rFonts w:ascii="Segoe UI" w:hAnsi="Segoe UI"/>
+          <w:b/>
+          <w:i w:val="0"/>
+          <w:color w:val="2D6A4F"/>
+          <w:sz w:val="27"/>
+        </w:rPr>
+        <w:t>12.1 Non-Negotiable Architecture &amp; Core Rules</w:t>
+      </w:r>
+    </w:p>
+    <w:p>
+      <w:pPr>
+        <w:spacing w:before="0" w:after="120" w:line="276" w:lineRule="auto"/>
+        <w:jc w:val="left"/>
+      </w:pPr>
+      <w:r>
+        <w:rPr>
+          <w:rFonts w:ascii="Segoe UI" w:hAnsi="Segoe UI"/>
+          <w:b w:val="0"/>
+          <w:i w:val="0"/>
+          <w:color w:val="1E293B"/>
+          <w:sz w:val="21"/>
+        </w:rPr>
+        <w:t>1. Independent Consignment Identity: First-class consignment series (CN-YYYY-XXXX) decoupled from invoice and challan numbering, supporting 1-to-many and many-to-1 relationships.</w:t>
+      </w:r>
+    </w:p>
+    <w:p>
+      <w:pPr>
+        <w:spacing w:before="0" w:after="120" w:line="276" w:lineRule="auto"/>
+        <w:jc w:val="left"/>
+      </w:pPr>
+      <w:r>
+        <w:rPr>
+          <w:rFonts w:ascii="Segoe UI" w:hAnsi="Segoe UI"/>
+          <w:b w:val="0"/>
+          <w:i w:val="0"/>
+          <w:color w:val="1E293B"/>
+          <w:sz w:val="21"/>
+        </w:rPr>
+        <w:t>2. Admin-Funded Client Cargo Architecture: In central platform distribution setups where Platform Admin finances freight for Client Companies, the Client Company General Ledger (DOC-08) is NEVER debited automatically. The expense is recognized solely in the Admin Company Ledger under Account 5200 (Freight &amp; Logistics Expense).</w:t>
+      </w:r>
+    </w:p>
+    <w:p>
+      <w:pPr>
+        <w:spacing w:before="0" w:after="120" w:line="276" w:lineRule="auto"/>
+        <w:jc w:val="left"/>
+      </w:pPr>
+      <w:r>
+        <w:rPr>
+          <w:rFonts w:ascii="Segoe UI" w:hAnsi="Segoe UI"/>
+          <w:b w:val="0"/>
+          <w:i w:val="0"/>
+          <w:color w:val="1E293B"/>
+          <w:sz w:val="21"/>
+        </w:rPr>
+        <w:t>3. Combined Reporting Toggle: Platform Admin executives can toggle aggregate multi-client freight reporting without breaching tenant isolation boundaries.</w:t>
+      </w:r>
+    </w:p>
+    <w:p>
+      <w:pPr>
+        <w:spacing w:before="0" w:after="120" w:line="276" w:lineRule="auto"/>
+        <w:jc w:val="left"/>
+      </w:pPr>
+      <w:r>
+        <w:rPr>
+          <w:rFonts w:ascii="Segoe UI" w:hAnsi="Segoe UI"/>
+          <w:b w:val="0"/>
+          <w:i w:val="0"/>
+          <w:color w:val="1E293B"/>
+          <w:sz w:val="21"/>
+        </w:rPr>
+        <w:t>4. Volumetric CBM Formula: CBM = (Length (cm) * Width (cm) * Height (cm)) / 1,000,000. Multi-package barcodes (PKG-YYYY-XXXX-NN) track individual tare, gross weight, and fragility.</w:t>
+      </w:r>
+    </w:p>
+    <w:p>
+      <w:pPr>
+        <w:spacing w:before="0" w:after="120" w:line="276" w:lineRule="auto"/>
+        <w:jc w:val="left"/>
+      </w:pPr>
+      <w:r>
+        <w:rPr>
+          <w:rFonts w:ascii="Segoe UI" w:hAnsi="Segoe UI"/>
+          <w:b w:val="0"/>
+          <w:i w:val="0"/>
+          <w:color w:val="1E293B"/>
+          <w:sz w:val="21"/>
+        </w:rPr>
+        <w:t>5. Movement State Machine: PLANNED -&gt; READY_FOR_LOADING -&gt; LOADING -&gt; DISPATCHED -&gt; IN_TRANSIT -&gt; DELIVERED -&gt; CLOSED (with EXCEPTION branching).</w:t>
+      </w:r>
+    </w:p>
+    <w:p>
+      <w:pPr>
+        <w:spacing w:before="0" w:after="120" w:line="276" w:lineRule="auto"/>
+        <w:jc w:val="left"/>
+      </w:pPr>
+      <w:r>
+        <w:rPr>
+          <w:rFonts w:ascii="Segoe UI" w:hAnsi="Segoe UI"/>
+          <w:b w:val="0"/>
+          <w:i w:val="0"/>
+          <w:color w:val="1E293B"/>
+          <w:sz w:val="21"/>
+        </w:rPr>
+        <w:t>6. Proof of Delivery (POD) &amp; Exception Desk: Four-eyes physical delivery validation tracking accepted vs damaged/short quantities and carrier liability claims.</w:t>
+      </w:r>
+    </w:p>
+    <w:p>
+      <w:pPr>
+        <w:keepNext/>
+        <w:spacing w:before="280" w:after="120"/>
+      </w:pPr>
+      <w:r>
+        <w:rPr>
+          <w:rFonts w:ascii="Segoe UI" w:hAnsi="Segoe UI"/>
+          <w:b/>
+          <w:i w:val="0"/>
+          <w:color w:val="2D6A4F"/>
+          <w:sz w:val="27"/>
+        </w:rPr>
+        <w:t>12.2 Operational Cockpits &amp; Launchers</w:t>
+      </w:r>
+    </w:p>
+    <w:p>
+      <w:pPr>
+        <w:spacing w:before="0" w:after="120" w:line="276" w:lineRule="auto"/>
+        <w:jc w:val="left"/>
+      </w:pPr>
+      <w:r>
+        <w:rPr>
+          <w:rFonts w:ascii="Segoe UI" w:hAnsi="Segoe UI"/>
+          <w:b w:val="0"/>
+          <w:i w:val="0"/>
+          <w:color w:val="1E293B"/>
+          <w:sz w:val="21"/>
+        </w:rPr>
+        <w:t>• Cargo Board (/cargo, [Ctrl+1]): Top KPI strip, visual status matrix, new consignment creation modal ([F6]), slide-over detail drawer, and status progression buttons.</w:t>
+      </w:r>
+    </w:p>
+    <w:p>
+      <w:pPr>
+        <w:spacing w:before="0" w:after="120" w:line="276" w:lineRule="auto"/>
+        <w:jc w:val="left"/>
+      </w:pPr>
+      <w:r>
+        <w:rPr>
+          <w:rFonts w:ascii="Segoe UI" w:hAnsi="Segoe UI"/>
+          <w:b w:val="0"/>
+          <w:i w:val="0"/>
+          <w:color w:val="1E293B"/>
+          <w:sz w:val="21"/>
+        </w:rPr>
+        <w:t>• Cargo Cost Center (/cargo/costs, [F4]): Admin-borne vs Client-borne financial bifurcation, combined multi-client reporting toggle, and CSV manifest exporter.</w:t>
+      </w:r>
+    </w:p>
+    <w:p>
+      <w:pPr>
+        <w:spacing w:before="0" w:after="120" w:line="276" w:lineRule="auto"/>
+        <w:jc w:val="left"/>
+      </w:pPr>
+      <w:r>
+        <w:rPr>
+          <w:rFonts w:ascii="Segoe UI" w:hAnsi="Segoe UI"/>
+          <w:b w:val="0"/>
+          <w:i w:val="0"/>
+          <w:color w:val="1E293B"/>
+          <w:sz w:val="21"/>
+        </w:rPr>
+        <w:t>• POD &amp; Exception Desk (/cargo/pod-exceptions): Pending delivery receiving queue with 4-eyes validation, accepted vs short/damaged quantities, and transit claims resolution desk.</w:t>
+      </w:r>
+    </w:p>
+    <w:p>
+      <w:pPr>
+        <w:keepNext/>
+        <w:spacing w:before="360" w:after="160"/>
+      </w:pPr>
+      <w:r>
+        <w:rPr>
+          <w:rFonts w:ascii="Segoe UI" w:hAnsi="Segoe UI"/>
+          <w:b/>
+          <w:i w:val="0"/>
+          <w:color w:val="1B4332"/>
+          <w:sz w:val="36"/>
+        </w:rPr>
+        <w:t>13. Relational Database Schema Dictionary (PostgreSQL)</w:t>
+      </w:r>
+    </w:p>
+    <w:p>
+      <w:pPr>
+        <w:spacing w:before="0" w:after="120" w:line="276" w:lineRule="auto"/>
+        <w:jc w:val="left"/>
+      </w:pPr>
+      <w:r>
+        <w:rPr>
+          <w:rFonts w:ascii="Segoe UI" w:hAnsi="Segoe UI"/>
+          <w:b w:val="0"/>
+          <w:i w:val="0"/>
+          <w:color w:val="1E293B"/>
+          <w:sz w:val="21"/>
+        </w:rPr>
+        <w:t>The database architecture encompasses 25+ high-performance relational tables:</w:t>
       </w:r>
     </w:p>
     <w:tbl>
@@ -7262,6 +7470,338 @@
                 <w:sz w:val="18"/>
               </w:rPr>
               <w:t>Statutory litigation/inquiry holds. Columns: scope_type, scope_description, reason, created_by_id, released_at, release_reason.</w:t>
+            </w:r>
+          </w:p>
+        </w:tc>
+      </w:tr>
+      <w:tr>
+        <w:tc>
+          <w:tcPr>
+            <w:tcW w:type="dxa" w:w="2160"/>
+            <w:shd w:fill="F8FAF9"/>
+            <w:tcMar>
+              <w:top w:w="100" w:type="dxa"/>
+              <w:bottom w:w="100" w:type="dxa"/>
+              <w:left w:w="150" w:type="dxa"/>
+              <w:right w:w="150" w:type="dxa"/>
+            </w:tcMar>
+          </w:tcPr>
+          <w:p>
+            <w:pPr>
+              <w:jc w:val="left"/>
+            </w:pPr>
+            <w:r>
+              <w:rPr>
+                <w:rFonts w:ascii="Segoe UI" w:hAnsi="Segoe UI"/>
+                <w:b w:val="0"/>
+                <w:i w:val="0"/>
+                <w:color w:val="1E293B"/>
+                <w:sz w:val="18"/>
+              </w:rPr>
+              <w:t>consignments</w:t>
+            </w:r>
+          </w:p>
+        </w:tc>
+        <w:tc>
+          <w:tcPr>
+            <w:tcW w:type="dxa" w:w="2880"/>
+            <w:shd w:fill="F8FAF9"/>
+            <w:tcMar>
+              <w:top w:w="100" w:type="dxa"/>
+              <w:bottom w:w="100" w:type="dxa"/>
+              <w:left w:w="150" w:type="dxa"/>
+              <w:right w:w="150" w:type="dxa"/>
+            </w:tcMar>
+          </w:tcPr>
+          <w:p>
+            <w:pPr>
+              <w:jc w:val="left"/>
+            </w:pPr>
+            <w:r>
+              <w:rPr>
+                <w:rFonts w:ascii="Segoe UI" w:hAnsi="Segoe UI"/>
+                <w:b w:val="0"/>
+                <w:i w:val="0"/>
+                <w:color w:val="1E293B"/>
+                <w:sz w:val="18"/>
+              </w:rPr>
+              <w:t>id UUID (PK), consignment_number UNIQUE</w:t>
+            </w:r>
+          </w:p>
+        </w:tc>
+        <w:tc>
+          <w:tcPr>
+            <w:tcW w:type="dxa" w:w="4320"/>
+            <w:shd w:fill="F8FAF9"/>
+            <w:tcMar>
+              <w:top w:w="100" w:type="dxa"/>
+              <w:bottom w:w="100" w:type="dxa"/>
+              <w:left w:w="150" w:type="dxa"/>
+              <w:right w:w="150" w:type="dxa"/>
+            </w:tcMar>
+          </w:tcPr>
+          <w:p>
+            <w:pPr>
+              <w:jc w:val="left"/>
+            </w:pPr>
+            <w:r>
+              <w:rPr>
+                <w:rFonts w:ascii="Segoe UI" w:hAnsi="Segoe UI"/>
+                <w:b w:val="0"/>
+                <w:i w:val="0"/>
+                <w:color w:val="1E293B"/>
+                <w:sz w:val="18"/>
+              </w:rPr>
+              <w:t>Decoupled freight shipment. Columns: company_id, document_number, transporter_name, vehicle_no, driver_name, origin_hub, destination_hub, lr_no, status, is_admin_funded.</w:t>
+            </w:r>
+          </w:p>
+        </w:tc>
+      </w:tr>
+      <w:tr>
+        <w:tc>
+          <w:tcPr>
+            <w:tcW w:type="dxa" w:w="2160"/>
+            <w:shd w:fill="FFFFFF"/>
+            <w:tcMar>
+              <w:top w:w="100" w:type="dxa"/>
+              <w:bottom w:w="100" w:type="dxa"/>
+              <w:left w:w="150" w:type="dxa"/>
+              <w:right w:w="150" w:type="dxa"/>
+            </w:tcMar>
+          </w:tcPr>
+          <w:p>
+            <w:pPr>
+              <w:jc w:val="left"/>
+            </w:pPr>
+            <w:r>
+              <w:rPr>
+                <w:rFonts w:ascii="Segoe UI" w:hAnsi="Segoe UI"/>
+                <w:b w:val="0"/>
+                <w:i w:val="0"/>
+                <w:color w:val="1E293B"/>
+                <w:sz w:val="18"/>
+              </w:rPr>
+              <w:t>cargo_packages</w:t>
+            </w:r>
+          </w:p>
+        </w:tc>
+        <w:tc>
+          <w:tcPr>
+            <w:tcW w:type="dxa" w:w="2880"/>
+            <w:shd w:fill="FFFFFF"/>
+            <w:tcMar>
+              <w:top w:w="100" w:type="dxa"/>
+              <w:bottom w:w="100" w:type="dxa"/>
+              <w:left w:w="150" w:type="dxa"/>
+              <w:right w:w="150" w:type="dxa"/>
+            </w:tcMar>
+          </w:tcPr>
+          <w:p>
+            <w:pPr>
+              <w:jc w:val="left"/>
+            </w:pPr>
+            <w:r>
+              <w:rPr>
+                <w:rFonts w:ascii="Segoe UI" w:hAnsi="Segoe UI"/>
+                <w:b w:val="0"/>
+                <w:i w:val="0"/>
+                <w:color w:val="1E293B"/>
+                <w:sz w:val="18"/>
+              </w:rPr>
+              <w:t>id UUID (PK), consignment_id (FK)</w:t>
+            </w:r>
+          </w:p>
+        </w:tc>
+        <w:tc>
+          <w:tcPr>
+            <w:tcW w:type="dxa" w:w="4320"/>
+            <w:shd w:fill="FFFFFF"/>
+            <w:tcMar>
+              <w:top w:w="100" w:type="dxa"/>
+              <w:bottom w:w="100" w:type="dxa"/>
+              <w:left w:w="150" w:type="dxa"/>
+              <w:right w:w="150" w:type="dxa"/>
+            </w:tcMar>
+          </w:tcPr>
+          <w:p>
+            <w:pPr>
+              <w:jc w:val="left"/>
+            </w:pPr>
+            <w:r>
+              <w:rPr>
+                <w:rFonts w:ascii="Segoe UI" w:hAnsi="Segoe UI"/>
+                <w:b w:val="0"/>
+                <w:i w:val="0"/>
+                <w:color w:val="1E293B"/>
+                <w:sz w:val="18"/>
+              </w:rPr>
+              <w:t>Multi-package volumetric hierarchy. Columns: package_type, barcode UNIQUE, gross_weight, tare_weight, net_weight, length_cm, width_cm, height_cm, cbm, is_fragile, status.</w:t>
+            </w:r>
+          </w:p>
+        </w:tc>
+      </w:tr>
+      <w:tr>
+        <w:tc>
+          <w:tcPr>
+            <w:tcW w:type="dxa" w:w="2160"/>
+            <w:shd w:fill="F8FAF9"/>
+            <w:tcMar>
+              <w:top w:w="100" w:type="dxa"/>
+              <w:bottom w:w="100" w:type="dxa"/>
+              <w:left w:w="150" w:type="dxa"/>
+              <w:right w:w="150" w:type="dxa"/>
+            </w:tcMar>
+          </w:tcPr>
+          <w:p>
+            <w:pPr>
+              <w:jc w:val="left"/>
+            </w:pPr>
+            <w:r>
+              <w:rPr>
+                <w:rFonts w:ascii="Segoe UI" w:hAnsi="Segoe UI"/>
+                <w:b w:val="0"/>
+                <w:i w:val="0"/>
+                <w:color w:val="1E293B"/>
+                <w:sz w:val="18"/>
+              </w:rPr>
+              <w:t>cargo_costs</w:t>
+            </w:r>
+          </w:p>
+        </w:tc>
+        <w:tc>
+          <w:tcPr>
+            <w:tcW w:type="dxa" w:w="2880"/>
+            <w:shd w:fill="F8FAF9"/>
+            <w:tcMar>
+              <w:top w:w="100" w:type="dxa"/>
+              <w:bottom w:w="100" w:type="dxa"/>
+              <w:left w:w="150" w:type="dxa"/>
+              <w:right w:w="150" w:type="dxa"/>
+            </w:tcMar>
+          </w:tcPr>
+          <w:p>
+            <w:pPr>
+              <w:jc w:val="left"/>
+            </w:pPr>
+            <w:r>
+              <w:rPr>
+                <w:rFonts w:ascii="Segoe UI" w:hAnsi="Segoe UI"/>
+                <w:b w:val="0"/>
+                <w:i w:val="0"/>
+                <w:color w:val="1E293B"/>
+                <w:sz w:val="18"/>
+              </w:rPr>
+              <w:t>id UUID (PK), consignment_id (FK)</w:t>
+            </w:r>
+          </w:p>
+        </w:tc>
+        <w:tc>
+          <w:tcPr>
+            <w:tcW w:type="dxa" w:w="4320"/>
+            <w:shd w:fill="F8FAF9"/>
+            <w:tcMar>
+              <w:top w:w="100" w:type="dxa"/>
+              <w:bottom w:w="100" w:type="dxa"/>
+              <w:left w:w="150" w:type="dxa"/>
+              <w:right w:w="150" w:type="dxa"/>
+            </w:tcMar>
+          </w:tcPr>
+          <w:p>
+            <w:pPr>
+              <w:jc w:val="left"/>
+            </w:pPr>
+            <w:r>
+              <w:rPr>
+                <w:rFonts w:ascii="Segoe UI" w:hAnsi="Segoe UI"/>
+                <w:b w:val="0"/>
+                <w:i w:val="0"/>
+                <w:color w:val="1E293B"/>
+                <w:sz w:val="18"/>
+              </w:rPr>
+              <w:t>Bifurcated freight expenditure. Columns: beneficiary_company_id, cost_bearer_company_id, cost_type, gross_cost, recovery_amount, net_bearer_cost, is_admin_borne, recovery_status.</w:t>
+            </w:r>
+          </w:p>
+        </w:tc>
+      </w:tr>
+      <w:tr>
+        <w:tc>
+          <w:tcPr>
+            <w:tcW w:type="dxa" w:w="2160"/>
+            <w:shd w:fill="FFFFFF"/>
+            <w:tcMar>
+              <w:top w:w="100" w:type="dxa"/>
+              <w:bottom w:w="100" w:type="dxa"/>
+              <w:left w:w="150" w:type="dxa"/>
+              <w:right w:w="150" w:type="dxa"/>
+            </w:tcMar>
+          </w:tcPr>
+          <w:p>
+            <w:pPr>
+              <w:jc w:val="left"/>
+            </w:pPr>
+            <w:r>
+              <w:rPr>
+                <w:rFonts w:ascii="Segoe UI" w:hAnsi="Segoe UI"/>
+                <w:b w:val="0"/>
+                <w:i w:val="0"/>
+                <w:color w:val="1E293B"/>
+                <w:sz w:val="18"/>
+              </w:rPr>
+              <w:t>pod_records</w:t>
+            </w:r>
+          </w:p>
+        </w:tc>
+        <w:tc>
+          <w:tcPr>
+            <w:tcW w:type="dxa" w:w="2880"/>
+            <w:shd w:fill="FFFFFF"/>
+            <w:tcMar>
+              <w:top w:w="100" w:type="dxa"/>
+              <w:bottom w:w="100" w:type="dxa"/>
+              <w:left w:w="150" w:type="dxa"/>
+              <w:right w:w="150" w:type="dxa"/>
+            </w:tcMar>
+          </w:tcPr>
+          <w:p>
+            <w:pPr>
+              <w:jc w:val="left"/>
+            </w:pPr>
+            <w:r>
+              <w:rPr>
+                <w:rFonts w:ascii="Segoe UI" w:hAnsi="Segoe UI"/>
+                <w:b w:val="0"/>
+                <w:i w:val="0"/>
+                <w:color w:val="1E293B"/>
+                <w:sz w:val="18"/>
+              </w:rPr>
+              <w:t>id UUID (PK), consignment_id (FK)</w:t>
+            </w:r>
+          </w:p>
+        </w:tc>
+        <w:tc>
+          <w:tcPr>
+            <w:tcW w:type="dxa" w:w="4320"/>
+            <w:shd w:fill="FFFFFF"/>
+            <w:tcMar>
+              <w:top w:w="100" w:type="dxa"/>
+              <w:bottom w:w="100" w:type="dxa"/>
+              <w:left w:w="150" w:type="dxa"/>
+              <w:right w:w="150" w:type="dxa"/>
+            </w:tcMar>
+          </w:tcPr>
+          <w:p>
+            <w:pPr>
+              <w:jc w:val="left"/>
+            </w:pPr>
+            <w:r>
+              <w:rPr>
+                <w:rFonts w:ascii="Segoe UI" w:hAnsi="Segoe UI"/>
+                <w:b w:val="0"/>
+                <w:i w:val="0"/>
+                <w:color w:val="1E293B"/>
+                <w:sz w:val="18"/>
+              </w:rPr>
+              <w:t>Proof of delivery &amp; discrepancy record. Columns: received_by, received_at, accepted_qty, short_qty, damage_qty, signature_token, remarks, status.</w:t>
             </w:r>
           </w:p>
         </w:tc>
@@ -7285,7 +7825,7 @@
           <w:color w:val="1B4332"/>
           <w:sz w:val="36"/>
         </w:rPr>
-        <w:t>13. RESTful API Directory &amp; Endpoint Specifications</w:t>
+        <w:t>14. RESTful API Directory &amp; Endpoint Specifications</w:t>
       </w:r>
     </w:p>
     <w:p>
@@ -7301,7 +7841,7 @@
           <w:color w:val="1E293B"/>
           <w:sz w:val="21"/>
         </w:rPr>
-        <w:t>The backend exposes a high-speed, asynchronous RESTful API layer organized by domain:</w:t>
+        <w:t>The backend exposes a high-speed, asynchronous RESTful API layer organized by domain (40+ endpoints):</w:t>
       </w:r>
     </w:p>
     <w:tbl>
@@ -9967,6 +10507,670 @@
                 <w:sz w:val="18"/>
               </w:rPr>
               <w:t>Produces cryptographically sealed audit evidence package with SHA-256 root hash.</w:t>
+            </w:r>
+          </w:p>
+        </w:tc>
+      </w:tr>
+      <w:tr>
+        <w:tc>
+          <w:tcPr>
+            <w:tcW w:type="dxa" w:w="3168"/>
+            <w:shd w:fill="F8FAF9"/>
+            <w:tcMar>
+              <w:top w:w="100" w:type="dxa"/>
+              <w:bottom w:w="100" w:type="dxa"/>
+              <w:left w:w="150" w:type="dxa"/>
+              <w:right w:w="150" w:type="dxa"/>
+            </w:tcMar>
+          </w:tcPr>
+          <w:p>
+            <w:pPr>
+              <w:jc w:val="left"/>
+            </w:pPr>
+            <w:r>
+              <w:rPr>
+                <w:rFonts w:ascii="Segoe UI" w:hAnsi="Segoe UI"/>
+                <w:b w:val="0"/>
+                <w:i w:val="0"/>
+                <w:color w:val="1E293B"/>
+                <w:sz w:val="18"/>
+              </w:rPr>
+              <w:t>/api/cargo/summary</w:t>
+            </w:r>
+          </w:p>
+        </w:tc>
+        <w:tc>
+          <w:tcPr>
+            <w:tcW w:type="dxa" w:w="1296"/>
+            <w:shd w:fill="F8FAF9"/>
+            <w:tcMar>
+              <w:top w:w="100" w:type="dxa"/>
+              <w:bottom w:w="100" w:type="dxa"/>
+              <w:left w:w="150" w:type="dxa"/>
+              <w:right w:w="150" w:type="dxa"/>
+            </w:tcMar>
+          </w:tcPr>
+          <w:p>
+            <w:pPr>
+              <w:jc w:val="left"/>
+            </w:pPr>
+            <w:r>
+              <w:rPr>
+                <w:rFonts w:ascii="Segoe UI" w:hAnsi="Segoe UI"/>
+                <w:b w:val="0"/>
+                <w:i w:val="0"/>
+                <w:color w:val="1E293B"/>
+                <w:sz w:val="18"/>
+              </w:rPr>
+              <w:t>GET</w:t>
+            </w:r>
+          </w:p>
+        </w:tc>
+        <w:tc>
+          <w:tcPr>
+            <w:tcW w:type="dxa" w:w="4896"/>
+            <w:shd w:fill="F8FAF9"/>
+            <w:tcMar>
+              <w:top w:w="100" w:type="dxa"/>
+              <w:bottom w:w="100" w:type="dxa"/>
+              <w:left w:w="150" w:type="dxa"/>
+              <w:right w:w="150" w:type="dxa"/>
+            </w:tcMar>
+          </w:tcPr>
+          <w:p>
+            <w:pPr>
+              <w:jc w:val="left"/>
+            </w:pPr>
+            <w:r>
+              <w:rPr>
+                <w:rFonts w:ascii="Segoe UI" w:hAnsi="Segoe UI"/>
+                <w:b w:val="0"/>
+                <w:i w:val="0"/>
+                <w:color w:val="1E293B"/>
+                <w:sz w:val="18"/>
+              </w:rPr>
+              <w:t>Aggregates total consignments, in-transit, volumetric CBM, Admin-borne cost, pending POD.</w:t>
+            </w:r>
+          </w:p>
+        </w:tc>
+      </w:tr>
+      <w:tr>
+        <w:tc>
+          <w:tcPr>
+            <w:tcW w:type="dxa" w:w="3168"/>
+            <w:shd w:fill="FFFFFF"/>
+            <w:tcMar>
+              <w:top w:w="100" w:type="dxa"/>
+              <w:bottom w:w="100" w:type="dxa"/>
+              <w:left w:w="150" w:type="dxa"/>
+              <w:right w:w="150" w:type="dxa"/>
+            </w:tcMar>
+          </w:tcPr>
+          <w:p>
+            <w:pPr>
+              <w:jc w:val="left"/>
+            </w:pPr>
+            <w:r>
+              <w:rPr>
+                <w:rFonts w:ascii="Segoe UI" w:hAnsi="Segoe UI"/>
+                <w:b w:val="0"/>
+                <w:i w:val="0"/>
+                <w:color w:val="1E293B"/>
+                <w:sz w:val="18"/>
+              </w:rPr>
+              <w:t>/api/cargo/consignments</w:t>
+            </w:r>
+          </w:p>
+        </w:tc>
+        <w:tc>
+          <w:tcPr>
+            <w:tcW w:type="dxa" w:w="1296"/>
+            <w:shd w:fill="FFFFFF"/>
+            <w:tcMar>
+              <w:top w:w="100" w:type="dxa"/>
+              <w:bottom w:w="100" w:type="dxa"/>
+              <w:left w:w="150" w:type="dxa"/>
+              <w:right w:w="150" w:type="dxa"/>
+            </w:tcMar>
+          </w:tcPr>
+          <w:p>
+            <w:pPr>
+              <w:jc w:val="left"/>
+            </w:pPr>
+            <w:r>
+              <w:rPr>
+                <w:rFonts w:ascii="Segoe UI" w:hAnsi="Segoe UI"/>
+                <w:b w:val="0"/>
+                <w:i w:val="0"/>
+                <w:color w:val="1E293B"/>
+                <w:sz w:val="18"/>
+              </w:rPr>
+              <w:t>GET / POST</w:t>
+            </w:r>
+          </w:p>
+        </w:tc>
+        <w:tc>
+          <w:tcPr>
+            <w:tcW w:type="dxa" w:w="4896"/>
+            <w:shd w:fill="FFFFFF"/>
+            <w:tcMar>
+              <w:top w:w="100" w:type="dxa"/>
+              <w:bottom w:w="100" w:type="dxa"/>
+              <w:left w:w="150" w:type="dxa"/>
+              <w:right w:w="150" w:type="dxa"/>
+            </w:tcMar>
+          </w:tcPr>
+          <w:p>
+            <w:pPr>
+              <w:jc w:val="left"/>
+            </w:pPr>
+            <w:r>
+              <w:rPr>
+                <w:rFonts w:ascii="Segoe UI" w:hAnsi="Segoe UI"/>
+                <w:b w:val="0"/>
+                <w:i w:val="0"/>
+                <w:color w:val="1E293B"/>
+                <w:sz w:val="18"/>
+              </w:rPr>
+              <w:t>Multi-tenant search &amp; list / Creates new consignment with series CN-YYYY-XXXX continuation.</w:t>
+            </w:r>
+          </w:p>
+        </w:tc>
+      </w:tr>
+      <w:tr>
+        <w:tc>
+          <w:tcPr>
+            <w:tcW w:type="dxa" w:w="3168"/>
+            <w:shd w:fill="F8FAF9"/>
+            <w:tcMar>
+              <w:top w:w="100" w:type="dxa"/>
+              <w:bottom w:w="100" w:type="dxa"/>
+              <w:left w:w="150" w:type="dxa"/>
+              <w:right w:w="150" w:type="dxa"/>
+            </w:tcMar>
+          </w:tcPr>
+          <w:p>
+            <w:pPr>
+              <w:jc w:val="left"/>
+            </w:pPr>
+            <w:r>
+              <w:rPr>
+                <w:rFonts w:ascii="Segoe UI" w:hAnsi="Segoe UI"/>
+                <w:b w:val="0"/>
+                <w:i w:val="0"/>
+                <w:color w:val="1E293B"/>
+                <w:sz w:val="18"/>
+              </w:rPr>
+              <w:t>/api/cargo/consignments/{id}</w:t>
+            </w:r>
+          </w:p>
+        </w:tc>
+        <w:tc>
+          <w:tcPr>
+            <w:tcW w:type="dxa" w:w="1296"/>
+            <w:shd w:fill="F8FAF9"/>
+            <w:tcMar>
+              <w:top w:w="100" w:type="dxa"/>
+              <w:bottom w:w="100" w:type="dxa"/>
+              <w:left w:w="150" w:type="dxa"/>
+              <w:right w:w="150" w:type="dxa"/>
+            </w:tcMar>
+          </w:tcPr>
+          <w:p>
+            <w:pPr>
+              <w:jc w:val="left"/>
+            </w:pPr>
+            <w:r>
+              <w:rPr>
+                <w:rFonts w:ascii="Segoe UI" w:hAnsi="Segoe UI"/>
+                <w:b w:val="0"/>
+                <w:i w:val="0"/>
+                <w:color w:val="1E293B"/>
+                <w:sz w:val="18"/>
+              </w:rPr>
+              <w:t>GET</w:t>
+            </w:r>
+          </w:p>
+        </w:tc>
+        <w:tc>
+          <w:tcPr>
+            <w:tcW w:type="dxa" w:w="4896"/>
+            <w:shd w:fill="F8FAF9"/>
+            <w:tcMar>
+              <w:top w:w="100" w:type="dxa"/>
+              <w:bottom w:w="100" w:type="dxa"/>
+              <w:left w:w="150" w:type="dxa"/>
+              <w:right w:w="150" w:type="dxa"/>
+            </w:tcMar>
+          </w:tcPr>
+          <w:p>
+            <w:pPr>
+              <w:jc w:val="left"/>
+            </w:pPr>
+            <w:r>
+              <w:rPr>
+                <w:rFonts w:ascii="Segoe UI" w:hAnsi="Segoe UI"/>
+                <w:b w:val="0"/>
+                <w:i w:val="0"/>
+                <w:color w:val="1E293B"/>
+                <w:sz w:val="18"/>
+              </w:rPr>
+              <w:t>Comprehensive consignment detail with multi-package CBM calculations and costs.</w:t>
+            </w:r>
+          </w:p>
+        </w:tc>
+      </w:tr>
+      <w:tr>
+        <w:tc>
+          <w:tcPr>
+            <w:tcW w:type="dxa" w:w="3168"/>
+            <w:shd w:fill="FFFFFF"/>
+            <w:tcMar>
+              <w:top w:w="100" w:type="dxa"/>
+              <w:bottom w:w="100" w:type="dxa"/>
+              <w:left w:w="150" w:type="dxa"/>
+              <w:right w:w="150" w:type="dxa"/>
+            </w:tcMar>
+          </w:tcPr>
+          <w:p>
+            <w:pPr>
+              <w:jc w:val="left"/>
+            </w:pPr>
+            <w:r>
+              <w:rPr>
+                <w:rFonts w:ascii="Segoe UI" w:hAnsi="Segoe UI"/>
+                <w:b w:val="0"/>
+                <w:i w:val="0"/>
+                <w:color w:val="1E293B"/>
+                <w:sz w:val="18"/>
+              </w:rPr>
+              <w:t>/api/cargo/consignments/{id}/status</w:t>
+            </w:r>
+          </w:p>
+        </w:tc>
+        <w:tc>
+          <w:tcPr>
+            <w:tcW w:type="dxa" w:w="1296"/>
+            <w:shd w:fill="FFFFFF"/>
+            <w:tcMar>
+              <w:top w:w="100" w:type="dxa"/>
+              <w:bottom w:w="100" w:type="dxa"/>
+              <w:left w:w="150" w:type="dxa"/>
+              <w:right w:w="150" w:type="dxa"/>
+            </w:tcMar>
+          </w:tcPr>
+          <w:p>
+            <w:pPr>
+              <w:jc w:val="left"/>
+            </w:pPr>
+            <w:r>
+              <w:rPr>
+                <w:rFonts w:ascii="Segoe UI" w:hAnsi="Segoe UI"/>
+                <w:b w:val="0"/>
+                <w:i w:val="0"/>
+                <w:color w:val="1E293B"/>
+                <w:sz w:val="18"/>
+              </w:rPr>
+              <w:t>PUT</w:t>
+            </w:r>
+          </w:p>
+        </w:tc>
+        <w:tc>
+          <w:tcPr>
+            <w:tcW w:type="dxa" w:w="4896"/>
+            <w:shd w:fill="FFFFFF"/>
+            <w:tcMar>
+              <w:top w:w="100" w:type="dxa"/>
+              <w:bottom w:w="100" w:type="dxa"/>
+              <w:left w:w="150" w:type="dxa"/>
+              <w:right w:w="150" w:type="dxa"/>
+            </w:tcMar>
+          </w:tcPr>
+          <w:p>
+            <w:pPr>
+              <w:jc w:val="left"/>
+            </w:pPr>
+            <w:r>
+              <w:rPr>
+                <w:rFonts w:ascii="Segoe UI" w:hAnsi="Segoe UI"/>
+                <w:b w:val="0"/>
+                <w:i w:val="0"/>
+                <w:color w:val="1E293B"/>
+                <w:sz w:val="18"/>
+              </w:rPr>
+              <w:t>State machine progression (LOADING -&gt; DISPATCHED -&gt; IN_TRANSIT -&gt; DELIVERED).</w:t>
+            </w:r>
+          </w:p>
+        </w:tc>
+      </w:tr>
+      <w:tr>
+        <w:tc>
+          <w:tcPr>
+            <w:tcW w:type="dxa" w:w="3168"/>
+            <w:shd w:fill="F8FAF9"/>
+            <w:tcMar>
+              <w:top w:w="100" w:type="dxa"/>
+              <w:bottom w:w="100" w:type="dxa"/>
+              <w:left w:w="150" w:type="dxa"/>
+              <w:right w:w="150" w:type="dxa"/>
+            </w:tcMar>
+          </w:tcPr>
+          <w:p>
+            <w:pPr>
+              <w:jc w:val="left"/>
+            </w:pPr>
+            <w:r>
+              <w:rPr>
+                <w:rFonts w:ascii="Segoe UI" w:hAnsi="Segoe UI"/>
+                <w:b w:val="0"/>
+                <w:i w:val="0"/>
+                <w:color w:val="1E293B"/>
+                <w:sz w:val="18"/>
+              </w:rPr>
+              <w:t>/api/cargo/costs</w:t>
+            </w:r>
+          </w:p>
+        </w:tc>
+        <w:tc>
+          <w:tcPr>
+            <w:tcW w:type="dxa" w:w="1296"/>
+            <w:shd w:fill="F8FAF9"/>
+            <w:tcMar>
+              <w:top w:w="100" w:type="dxa"/>
+              <w:bottom w:w="100" w:type="dxa"/>
+              <w:left w:w="150" w:type="dxa"/>
+              <w:right w:w="150" w:type="dxa"/>
+            </w:tcMar>
+          </w:tcPr>
+          <w:p>
+            <w:pPr>
+              <w:jc w:val="left"/>
+            </w:pPr>
+            <w:r>
+              <w:rPr>
+                <w:rFonts w:ascii="Segoe UI" w:hAnsi="Segoe UI"/>
+                <w:b w:val="0"/>
+                <w:i w:val="0"/>
+                <w:color w:val="1E293B"/>
+                <w:sz w:val="18"/>
+              </w:rPr>
+              <w:t>GET</w:t>
+            </w:r>
+          </w:p>
+        </w:tc>
+        <w:tc>
+          <w:tcPr>
+            <w:tcW w:type="dxa" w:w="4896"/>
+            <w:shd w:fill="F8FAF9"/>
+            <w:tcMar>
+              <w:top w:w="100" w:type="dxa"/>
+              <w:bottom w:w="100" w:type="dxa"/>
+              <w:left w:w="150" w:type="dxa"/>
+              <w:right w:w="150" w:type="dxa"/>
+            </w:tcMar>
+          </w:tcPr>
+          <w:p>
+            <w:pPr>
+              <w:jc w:val="left"/>
+            </w:pPr>
+            <w:r>
+              <w:rPr>
+                <w:rFonts w:ascii="Segoe UI" w:hAnsi="Segoe UI"/>
+                <w:b w:val="0"/>
+                <w:i w:val="0"/>
+                <w:color w:val="1E293B"/>
+                <w:sz w:val="18"/>
+              </w:rPr>
+              <w:t>Admin-borne cost bifurcation with combined cross-client reporting toggle.</w:t>
+            </w:r>
+          </w:p>
+        </w:tc>
+      </w:tr>
+      <w:tr>
+        <w:tc>
+          <w:tcPr>
+            <w:tcW w:type="dxa" w:w="3168"/>
+            <w:shd w:fill="FFFFFF"/>
+            <w:tcMar>
+              <w:top w:w="100" w:type="dxa"/>
+              <w:bottom w:w="100" w:type="dxa"/>
+              <w:left w:w="150" w:type="dxa"/>
+              <w:right w:w="150" w:type="dxa"/>
+            </w:tcMar>
+          </w:tcPr>
+          <w:p>
+            <w:pPr>
+              <w:jc w:val="left"/>
+            </w:pPr>
+            <w:r>
+              <w:rPr>
+                <w:rFonts w:ascii="Segoe UI" w:hAnsi="Segoe UI"/>
+                <w:b w:val="0"/>
+                <w:i w:val="0"/>
+                <w:color w:val="1E293B"/>
+                <w:sz w:val="18"/>
+              </w:rPr>
+              <w:t>/api/cargo/pod-exceptions</w:t>
+            </w:r>
+          </w:p>
+        </w:tc>
+        <w:tc>
+          <w:tcPr>
+            <w:tcW w:type="dxa" w:w="1296"/>
+            <w:shd w:fill="FFFFFF"/>
+            <w:tcMar>
+              <w:top w:w="100" w:type="dxa"/>
+              <w:bottom w:w="100" w:type="dxa"/>
+              <w:left w:w="150" w:type="dxa"/>
+              <w:right w:w="150" w:type="dxa"/>
+            </w:tcMar>
+          </w:tcPr>
+          <w:p>
+            <w:pPr>
+              <w:jc w:val="left"/>
+            </w:pPr>
+            <w:r>
+              <w:rPr>
+                <w:rFonts w:ascii="Segoe UI" w:hAnsi="Segoe UI"/>
+                <w:b w:val="0"/>
+                <w:i w:val="0"/>
+                <w:color w:val="1E293B"/>
+                <w:sz w:val="18"/>
+              </w:rPr>
+              <w:t>GET</w:t>
+            </w:r>
+          </w:p>
+        </w:tc>
+        <w:tc>
+          <w:tcPr>
+            <w:tcW w:type="dxa" w:w="4896"/>
+            <w:shd w:fill="FFFFFF"/>
+            <w:tcMar>
+              <w:top w:w="100" w:type="dxa"/>
+              <w:bottom w:w="100" w:type="dxa"/>
+              <w:left w:w="150" w:type="dxa"/>
+              <w:right w:w="150" w:type="dxa"/>
+            </w:tcMar>
+          </w:tcPr>
+          <w:p>
+            <w:pPr>
+              <w:jc w:val="left"/>
+            </w:pPr>
+            <w:r>
+              <w:rPr>
+                <w:rFonts w:ascii="Segoe UI" w:hAnsi="Segoe UI"/>
+                <w:b w:val="0"/>
+                <w:i w:val="0"/>
+                <w:color w:val="1E293B"/>
+                <w:sz w:val="18"/>
+              </w:rPr>
+              <w:t>Pending delivery receiving queue and active transit exception claims desk.</w:t>
+            </w:r>
+          </w:p>
+        </w:tc>
+      </w:tr>
+      <w:tr>
+        <w:tc>
+          <w:tcPr>
+            <w:tcW w:type="dxa" w:w="3168"/>
+            <w:shd w:fill="F8FAF9"/>
+            <w:tcMar>
+              <w:top w:w="100" w:type="dxa"/>
+              <w:bottom w:w="100" w:type="dxa"/>
+              <w:left w:w="150" w:type="dxa"/>
+              <w:right w:w="150" w:type="dxa"/>
+            </w:tcMar>
+          </w:tcPr>
+          <w:p>
+            <w:pPr>
+              <w:jc w:val="left"/>
+            </w:pPr>
+            <w:r>
+              <w:rPr>
+                <w:rFonts w:ascii="Segoe UI" w:hAnsi="Segoe UI"/>
+                <w:b w:val="0"/>
+                <w:i w:val="0"/>
+                <w:color w:val="1E293B"/>
+                <w:sz w:val="18"/>
+              </w:rPr>
+              <w:t>/api/cargo/consignments/{id}/pod</w:t>
+            </w:r>
+          </w:p>
+        </w:tc>
+        <w:tc>
+          <w:tcPr>
+            <w:tcW w:type="dxa" w:w="1296"/>
+            <w:shd w:fill="F8FAF9"/>
+            <w:tcMar>
+              <w:top w:w="100" w:type="dxa"/>
+              <w:bottom w:w="100" w:type="dxa"/>
+              <w:left w:w="150" w:type="dxa"/>
+              <w:right w:w="150" w:type="dxa"/>
+            </w:tcMar>
+          </w:tcPr>
+          <w:p>
+            <w:pPr>
+              <w:jc w:val="left"/>
+            </w:pPr>
+            <w:r>
+              <w:rPr>
+                <w:rFonts w:ascii="Segoe UI" w:hAnsi="Segoe UI"/>
+                <w:b w:val="0"/>
+                <w:i w:val="0"/>
+                <w:color w:val="1E293B"/>
+                <w:sz w:val="18"/>
+              </w:rPr>
+              <w:t>POST</w:t>
+            </w:r>
+          </w:p>
+        </w:tc>
+        <w:tc>
+          <w:tcPr>
+            <w:tcW w:type="dxa" w:w="4896"/>
+            <w:shd w:fill="F8FAF9"/>
+            <w:tcMar>
+              <w:top w:w="100" w:type="dxa"/>
+              <w:bottom w:w="100" w:type="dxa"/>
+              <w:left w:w="150" w:type="dxa"/>
+              <w:right w:w="150" w:type="dxa"/>
+            </w:tcMar>
+          </w:tcPr>
+          <w:p>
+            <w:pPr>
+              <w:jc w:val="left"/>
+            </w:pPr>
+            <w:r>
+              <w:rPr>
+                <w:rFonts w:ascii="Segoe UI" w:hAnsi="Segoe UI"/>
+                <w:b w:val="0"/>
+                <w:i w:val="0"/>
+                <w:color w:val="1E293B"/>
+                <w:sz w:val="18"/>
+              </w:rPr>
+              <w:t>Submits delivery POD with accepted vs short/damaged quantities &amp; exception branch.</w:t>
+            </w:r>
+          </w:p>
+        </w:tc>
+      </w:tr>
+      <w:tr>
+        <w:tc>
+          <w:tcPr>
+            <w:tcW w:type="dxa" w:w="3168"/>
+            <w:shd w:fill="FFFFFF"/>
+            <w:tcMar>
+              <w:top w:w="100" w:type="dxa"/>
+              <w:bottom w:w="100" w:type="dxa"/>
+              <w:left w:w="150" w:type="dxa"/>
+              <w:right w:w="150" w:type="dxa"/>
+            </w:tcMar>
+          </w:tcPr>
+          <w:p>
+            <w:pPr>
+              <w:jc w:val="left"/>
+            </w:pPr>
+            <w:r>
+              <w:rPr>
+                <w:rFonts w:ascii="Segoe UI" w:hAnsi="Segoe UI"/>
+                <w:b w:val="0"/>
+                <w:i w:val="0"/>
+                <w:color w:val="1E293B"/>
+                <w:sz w:val="18"/>
+              </w:rPr>
+              <w:t>/api/cargo/consignments/{id}/resolve-exception</w:t>
+            </w:r>
+          </w:p>
+        </w:tc>
+        <w:tc>
+          <w:tcPr>
+            <w:tcW w:type="dxa" w:w="1296"/>
+            <w:shd w:fill="FFFFFF"/>
+            <w:tcMar>
+              <w:top w:w="100" w:type="dxa"/>
+              <w:bottom w:w="100" w:type="dxa"/>
+              <w:left w:w="150" w:type="dxa"/>
+              <w:right w:w="150" w:type="dxa"/>
+            </w:tcMar>
+          </w:tcPr>
+          <w:p>
+            <w:pPr>
+              <w:jc w:val="left"/>
+            </w:pPr>
+            <w:r>
+              <w:rPr>
+                <w:rFonts w:ascii="Segoe UI" w:hAnsi="Segoe UI"/>
+                <w:b w:val="0"/>
+                <w:i w:val="0"/>
+                <w:color w:val="1E293B"/>
+                <w:sz w:val="18"/>
+              </w:rPr>
+              <w:t>POST</w:t>
+            </w:r>
+          </w:p>
+        </w:tc>
+        <w:tc>
+          <w:tcPr>
+            <w:tcW w:type="dxa" w:w="4896"/>
+            <w:shd w:fill="FFFFFF"/>
+            <w:tcMar>
+              <w:top w:w="100" w:type="dxa"/>
+              <w:bottom w:w="100" w:type="dxa"/>
+              <w:left w:w="150" w:type="dxa"/>
+              <w:right w:w="150" w:type="dxa"/>
+            </w:tcMar>
+          </w:tcPr>
+          <w:p>
+            <w:pPr>
+              <w:jc w:val="left"/>
+            </w:pPr>
+            <w:r>
+              <w:rPr>
+                <w:rFonts w:ascii="Segoe UI" w:hAnsi="Segoe UI"/>
+                <w:b w:val="0"/>
+                <w:i w:val="0"/>
+                <w:color w:val="1E293B"/>
+                <w:sz w:val="18"/>
+              </w:rPr>
+              <w:t>Commits corrective resolution action (Carrier Claim / Demurrage Waiver) with audit log.</w:t>
             </w:r>
           </w:p>
         </w:tc>
@@ -9990,7 +11194,7 @@
           <w:color w:val="1B4332"/>
           <w:sz w:val="36"/>
         </w:rPr>
-        <w:t>14. Automated Selenium QA Matrix &amp; Production Deployment</w:t>
+        <w:t>15. Automated Selenium QA Matrix &amp; Production Deployment</w:t>
       </w:r>
     </w:p>
     <w:p>
@@ -10006,7 +11210,7 @@
           <w:color w:val="1E293B"/>
           <w:sz w:val="21"/>
         </w:rPr>
-        <w:t>The codebase maintains 100% automated test coverage across headless Chrome Selenium suites:</w:t>
+        <w:t>The codebase maintains 100% automated test coverage across 12 headless Chrome Selenium suites:</w:t>
       </w:r>
     </w:p>
     <w:tbl>
@@ -11012,6 +12216,89 @@
                 <w:sz w:val="18"/>
               </w:rPr>
               <w:t>100% PASS: Cryptographic SHA-256 hash chaining, diff drawer, seal validation, retention policies, legal holds, forensic anomalies, evidence pack.</w:t>
+            </w:r>
+          </w:p>
+        </w:tc>
+      </w:tr>
+      <w:tr>
+        <w:tc>
+          <w:tcPr>
+            <w:tcW w:type="dxa" w:w="3312"/>
+            <w:shd w:fill="F8FAF9"/>
+            <w:tcMar>
+              <w:top w:w="100" w:type="dxa"/>
+              <w:bottom w:w="100" w:type="dxa"/>
+              <w:left w:w="150" w:type="dxa"/>
+              <w:right w:w="150" w:type="dxa"/>
+            </w:tcMar>
+          </w:tcPr>
+          <w:p>
+            <w:pPr>
+              <w:jc w:val="left"/>
+            </w:pPr>
+            <w:r>
+              <w:rPr>
+                <w:rFonts w:ascii="Segoe UI" w:hAnsi="Segoe UI"/>
+                <w:b w:val="0"/>
+                <w:i w:val="0"/>
+                <w:color w:val="1E293B"/>
+                <w:sz w:val="18"/>
+              </w:rPr>
+              <w:t>test_cargo_consignment_selenium.py</w:t>
+            </w:r>
+          </w:p>
+        </w:tc>
+        <w:tc>
+          <w:tcPr>
+            <w:tcW w:type="dxa" w:w="1440"/>
+            <w:shd w:fill="F8FAF9"/>
+            <w:tcMar>
+              <w:top w:w="100" w:type="dxa"/>
+              <w:bottom w:w="100" w:type="dxa"/>
+              <w:left w:w="150" w:type="dxa"/>
+              <w:right w:w="150" w:type="dxa"/>
+            </w:tcMar>
+          </w:tcPr>
+          <w:p>
+            <w:pPr>
+              <w:jc w:val="left"/>
+            </w:pPr>
+            <w:r>
+              <w:rPr>
+                <w:rFonts w:ascii="Segoe UI" w:hAnsi="Segoe UI"/>
+                <w:b w:val="0"/>
+                <w:i w:val="0"/>
+                <w:color w:val="1E293B"/>
+                <w:sz w:val="18"/>
+              </w:rPr>
+              <w:t>10 Stages</w:t>
+            </w:r>
+          </w:p>
+        </w:tc>
+        <w:tc>
+          <w:tcPr>
+            <w:tcW w:type="dxa" w:w="4608"/>
+            <w:shd w:fill="F8FAF9"/>
+            <w:tcMar>
+              <w:top w:w="100" w:type="dxa"/>
+              <w:bottom w:w="100" w:type="dxa"/>
+              <w:left w:w="150" w:type="dxa"/>
+              <w:right w:w="150" w:type="dxa"/>
+            </w:tcMar>
+          </w:tcPr>
+          <w:p>
+            <w:pPr>
+              <w:jc w:val="left"/>
+            </w:pPr>
+            <w:r>
+              <w:rPr>
+                <w:rFonts w:ascii="Segoe UI" w:hAnsi="Segoe UI"/>
+                <w:b w:val="0"/>
+                <w:i w:val="0"/>
+                <w:color w:val="1E293B"/>
+                <w:sz w:val="18"/>
+              </w:rPr>
+              <w:t>100% PASS: Consignment registry, volumetric CBM, [Ctrl+1] Board, drawer inspection, cost center combined toggle, 4-eyes POD &amp; exception claims.</w:t>
             </w:r>
           </w:p>
         </w:tc>
@@ -11035,7 +12322,7 @@
           <w:color w:val="2D6A4F"/>
           <w:sz w:val="27"/>
         </w:rPr>
-        <w:t>14.1 Production Deployment &amp; Synchronization Commands</w:t>
+        <w:t>15.1 Production Deployment &amp; Synchronization Commands</w:t>
       </w:r>
     </w:p>
     <w:p>

</xml_diff>

<commit_message>
feat(freight): complete DOC-35 freight rate engine, reconciliation desk, and master docs
</commit_message>
<xml_diff>
--- a/ERP_ENTERPRISE_SYSTEM_COMPLETE_SOFTWARE_MASTER_WALKTHROUGH.docx
+++ b/ERP_ENTERPRISE_SYSTEM_COMPLETE_SOFTWARE_MASTER_WALKTHROUGH.docx
@@ -17303,6 +17303,776 @@
           </w:p>
         </w:tc>
       </w:tr>
+      <w:tr>
+        <w:tc>
+          <w:tcPr>
+            <w:tcW w:type="dxa" w:w="2160"/>
+            <w:shd w:fill="FFFFFF"/>
+            <w:tcMar>
+              <w:top w:w="100" w:type="dxa"/>
+              <w:bottom w:w="100" w:type="dxa"/>
+              <w:left w:w="150" w:type="dxa"/>
+              <w:right w:w="150" w:type="dxa"/>
+            </w:tcMar>
+          </w:tcPr>
+          <w:p>
+            <w:pPr>
+              <w:jc w:val="left"/>
+            </w:pPr>
+            <w:r>
+              <w:rPr>
+                <w:rFonts w:ascii="Segoe UI" w:hAnsi="Segoe UI"/>
+                <w:b w:val="0"/>
+                <w:i w:val="0"/>
+                <w:color w:val="1E293B"/>
+                <w:sz w:val="18"/>
+              </w:rPr>
+              <w:t>Counter Workbench (/)</w:t>
+            </w:r>
+          </w:p>
+        </w:tc>
+        <w:tc>
+          <w:tcPr>
+            <w:tcW w:type="dxa" w:w="2592"/>
+            <w:shd w:fill="FFFFFF"/>
+            <w:tcMar>
+              <w:top w:w="100" w:type="dxa"/>
+              <w:bottom w:w="100" w:type="dxa"/>
+              <w:left w:w="150" w:type="dxa"/>
+              <w:right w:w="150" w:type="dxa"/>
+            </w:tcMar>
+          </w:tcPr>
+          <w:p>
+            <w:pPr>
+              <w:jc w:val="left"/>
+            </w:pPr>
+            <w:r>
+              <w:rPr>
+                <w:rFonts w:ascii="Segoe UI" w:hAnsi="Segoe UI"/>
+                <w:b w:val="0"/>
+                <w:i w:val="0"/>
+                <w:color w:val="1E293B"/>
+                <w:sz w:val="18"/>
+              </w:rPr>
+              <w:t>#hub-btn-freight-management</w:t>
+            </w:r>
+          </w:p>
+        </w:tc>
+        <w:tc>
+          <w:tcPr>
+            <w:tcW w:type="dxa" w:w="1584"/>
+            <w:shd w:fill="FFFFFF"/>
+            <w:tcMar>
+              <w:top w:w="100" w:type="dxa"/>
+              <w:bottom w:w="100" w:type="dxa"/>
+              <w:left w:w="150" w:type="dxa"/>
+              <w:right w:w="150" w:type="dxa"/>
+            </w:tcMar>
+          </w:tcPr>
+          <w:p>
+            <w:pPr>
+              <w:jc w:val="left"/>
+            </w:pPr>
+            <w:r>
+              <w:rPr>
+                <w:rFonts w:ascii="Segoe UI" w:hAnsi="Segoe UI"/>
+                <w:b w:val="0"/>
+                <w:i w:val="0"/>
+                <w:color w:val="1E293B"/>
+                <w:sz w:val="18"/>
+              </w:rPr>
+              <w:t>Button [Ctrl+2]</w:t>
+            </w:r>
+          </w:p>
+        </w:tc>
+        <w:tc>
+          <w:tcPr>
+            <w:tcW w:type="dxa" w:w="3024"/>
+            <w:shd w:fill="FFFFFF"/>
+            <w:tcMar>
+              <w:top w:w="100" w:type="dxa"/>
+              <w:bottom w:w="100" w:type="dxa"/>
+              <w:left w:w="150" w:type="dxa"/>
+              <w:right w:w="150" w:type="dxa"/>
+            </w:tcMar>
+          </w:tcPr>
+          <w:p>
+            <w:pPr>
+              <w:jc w:val="left"/>
+            </w:pPr>
+            <w:r>
+              <w:rPr>
+                <w:rFonts w:ascii="Segoe UI" w:hAnsi="Segoe UI"/>
+                <w:b w:val="0"/>
+                <w:i w:val="0"/>
+                <w:color w:val="1E293B"/>
+                <w:sz w:val="18"/>
+              </w:rPr>
+              <w:t>Quick launcher navigating to Freight &amp; Rates Master (/freight/contracts).</w:t>
+            </w:r>
+          </w:p>
+        </w:tc>
+      </w:tr>
+      <w:tr>
+        <w:tc>
+          <w:tcPr>
+            <w:tcW w:type="dxa" w:w="2160"/>
+            <w:shd w:fill="F8FAF9"/>
+            <w:tcMar>
+              <w:top w:w="100" w:type="dxa"/>
+              <w:bottom w:w="100" w:type="dxa"/>
+              <w:left w:w="150" w:type="dxa"/>
+              <w:right w:w="150" w:type="dxa"/>
+            </w:tcMar>
+          </w:tcPr>
+          <w:p>
+            <w:pPr>
+              <w:jc w:val="left"/>
+            </w:pPr>
+            <w:r>
+              <w:rPr>
+                <w:rFonts w:ascii="Segoe UI" w:hAnsi="Segoe UI"/>
+                <w:b w:val="0"/>
+                <w:i w:val="0"/>
+                <w:color w:val="1E293B"/>
+                <w:sz w:val="18"/>
+              </w:rPr>
+              <w:t>Freight Rate Master (/freight/contracts)</w:t>
+            </w:r>
+          </w:p>
+        </w:tc>
+        <w:tc>
+          <w:tcPr>
+            <w:tcW w:type="dxa" w:w="2592"/>
+            <w:shd w:fill="F8FAF9"/>
+            <w:tcMar>
+              <w:top w:w="100" w:type="dxa"/>
+              <w:bottom w:w="100" w:type="dxa"/>
+              <w:left w:w="150" w:type="dxa"/>
+              <w:right w:w="150" w:type="dxa"/>
+            </w:tcMar>
+          </w:tcPr>
+          <w:p>
+            <w:pPr>
+              <w:jc w:val="left"/>
+            </w:pPr>
+            <w:r>
+              <w:rPr>
+                <w:rFonts w:ascii="Segoe UI" w:hAnsi="Segoe UI"/>
+                <w:b w:val="0"/>
+                <w:i w:val="0"/>
+                <w:color w:val="1E293B"/>
+                <w:sz w:val="18"/>
+              </w:rPr>
+              <w:t>#kpi-active-contracts</w:t>
+            </w:r>
+          </w:p>
+        </w:tc>
+        <w:tc>
+          <w:tcPr>
+            <w:tcW w:type="dxa" w:w="1584"/>
+            <w:shd w:fill="F8FAF9"/>
+            <w:tcMar>
+              <w:top w:w="100" w:type="dxa"/>
+              <w:bottom w:w="100" w:type="dxa"/>
+              <w:left w:w="150" w:type="dxa"/>
+              <w:right w:w="150" w:type="dxa"/>
+            </w:tcMar>
+          </w:tcPr>
+          <w:p>
+            <w:pPr>
+              <w:jc w:val="left"/>
+            </w:pPr>
+            <w:r>
+              <w:rPr>
+                <w:rFonts w:ascii="Segoe UI" w:hAnsi="Segoe UI"/>
+                <w:b w:val="0"/>
+                <w:i w:val="0"/>
+                <w:color w:val="1E293B"/>
+                <w:sz w:val="18"/>
+              </w:rPr>
+              <w:t>Card</w:t>
+            </w:r>
+          </w:p>
+        </w:tc>
+        <w:tc>
+          <w:tcPr>
+            <w:tcW w:type="dxa" w:w="3024"/>
+            <w:shd w:fill="F8FAF9"/>
+            <w:tcMar>
+              <w:top w:w="100" w:type="dxa"/>
+              <w:bottom w:w="100" w:type="dxa"/>
+              <w:left w:w="150" w:type="dxa"/>
+              <w:right w:w="150" w:type="dxa"/>
+            </w:tcMar>
+          </w:tcPr>
+          <w:p>
+            <w:pPr>
+              <w:jc w:val="left"/>
+            </w:pPr>
+            <w:r>
+              <w:rPr>
+                <w:rFonts w:ascii="Segoe UI" w:hAnsi="Segoe UI"/>
+                <w:b w:val="0"/>
+                <w:i w:val="0"/>
+                <w:color w:val="1E293B"/>
+                <w:sz w:val="18"/>
+              </w:rPr>
+              <w:t>Displays total active transporter rate contracts with tiered slabs.</w:t>
+            </w:r>
+          </w:p>
+        </w:tc>
+      </w:tr>
+      <w:tr>
+        <w:tc>
+          <w:tcPr>
+            <w:tcW w:type="dxa" w:w="2160"/>
+            <w:shd w:fill="FFFFFF"/>
+            <w:tcMar>
+              <w:top w:w="100" w:type="dxa"/>
+              <w:bottom w:w="100" w:type="dxa"/>
+              <w:left w:w="150" w:type="dxa"/>
+              <w:right w:w="150" w:type="dxa"/>
+            </w:tcMar>
+          </w:tcPr>
+          <w:p>
+            <w:pPr>
+              <w:jc w:val="left"/>
+            </w:pPr>
+            <w:r>
+              <w:rPr>
+                <w:rFonts w:ascii="Segoe UI" w:hAnsi="Segoe UI"/>
+                <w:b w:val="0"/>
+                <w:i w:val="0"/>
+                <w:color w:val="1E293B"/>
+                <w:sz w:val="18"/>
+              </w:rPr>
+              <w:t>Freight Rate Master (/freight/contracts)</w:t>
+            </w:r>
+          </w:p>
+        </w:tc>
+        <w:tc>
+          <w:tcPr>
+            <w:tcW w:type="dxa" w:w="2592"/>
+            <w:shd w:fill="FFFFFF"/>
+            <w:tcMar>
+              <w:top w:w="100" w:type="dxa"/>
+              <w:bottom w:w="100" w:type="dxa"/>
+              <w:left w:w="150" w:type="dxa"/>
+              <w:right w:w="150" w:type="dxa"/>
+            </w:tcMar>
+          </w:tcPr>
+          <w:p>
+            <w:pPr>
+              <w:jc w:val="left"/>
+            </w:pPr>
+            <w:r>
+              <w:rPr>
+                <w:rFonts w:ascii="Segoe UI" w:hAnsi="Segoe UI"/>
+                <w:b w:val="0"/>
+                <w:i w:val="0"/>
+                <w:color w:val="1E293B"/>
+                <w:sz w:val="18"/>
+              </w:rPr>
+              <w:t>#btn-switch-tab-sandbox</w:t>
+            </w:r>
+          </w:p>
+        </w:tc>
+        <w:tc>
+          <w:tcPr>
+            <w:tcW w:type="dxa" w:w="1584"/>
+            <w:shd w:fill="FFFFFF"/>
+            <w:tcMar>
+              <w:top w:w="100" w:type="dxa"/>
+              <w:bottom w:w="100" w:type="dxa"/>
+              <w:left w:w="150" w:type="dxa"/>
+              <w:right w:w="150" w:type="dxa"/>
+            </w:tcMar>
+          </w:tcPr>
+          <w:p>
+            <w:pPr>
+              <w:jc w:val="left"/>
+            </w:pPr>
+            <w:r>
+              <w:rPr>
+                <w:rFonts w:ascii="Segoe UI" w:hAnsi="Segoe UI"/>
+                <w:b w:val="0"/>
+                <w:i w:val="0"/>
+                <w:color w:val="1E293B"/>
+                <w:sz w:val="18"/>
+              </w:rPr>
+              <w:t>Tab [F4]</w:t>
+            </w:r>
+          </w:p>
+        </w:tc>
+        <w:tc>
+          <w:tcPr>
+            <w:tcW w:type="dxa" w:w="3024"/>
+            <w:shd w:fill="FFFFFF"/>
+            <w:tcMar>
+              <w:top w:w="100" w:type="dxa"/>
+              <w:bottom w:w="100" w:type="dxa"/>
+              <w:left w:w="150" w:type="dxa"/>
+              <w:right w:w="150" w:type="dxa"/>
+            </w:tcMar>
+          </w:tcPr>
+          <w:p>
+            <w:pPr>
+              <w:jc w:val="left"/>
+            </w:pPr>
+            <w:r>
+              <w:rPr>
+                <w:rFonts w:ascii="Segoe UI" w:hAnsi="Segoe UI"/>
+                <w:b w:val="0"/>
+                <w:i w:val="0"/>
+                <w:color w:val="1E293B"/>
+                <w:sz w:val="18"/>
+              </w:rPr>
+              <w:t>Toggles interactive deterministic calculation sandbox.</w:t>
+            </w:r>
+          </w:p>
+        </w:tc>
+      </w:tr>
+      <w:tr>
+        <w:tc>
+          <w:tcPr>
+            <w:tcW w:type="dxa" w:w="2160"/>
+            <w:shd w:fill="F8FAF9"/>
+            <w:tcMar>
+              <w:top w:w="100" w:type="dxa"/>
+              <w:bottom w:w="100" w:type="dxa"/>
+              <w:left w:w="150" w:type="dxa"/>
+              <w:right w:w="150" w:type="dxa"/>
+            </w:tcMar>
+          </w:tcPr>
+          <w:p>
+            <w:pPr>
+              <w:jc w:val="left"/>
+            </w:pPr>
+            <w:r>
+              <w:rPr>
+                <w:rFonts w:ascii="Segoe UI" w:hAnsi="Segoe UI"/>
+                <w:b w:val="0"/>
+                <w:i w:val="0"/>
+                <w:color w:val="1E293B"/>
+                <w:sz w:val="18"/>
+              </w:rPr>
+              <w:t>Freight Rate Master (/freight/contracts)</w:t>
+            </w:r>
+          </w:p>
+        </w:tc>
+        <w:tc>
+          <w:tcPr>
+            <w:tcW w:type="dxa" w:w="2592"/>
+            <w:shd w:fill="F8FAF9"/>
+            <w:tcMar>
+              <w:top w:w="100" w:type="dxa"/>
+              <w:bottom w:w="100" w:type="dxa"/>
+              <w:left w:w="150" w:type="dxa"/>
+              <w:right w:w="150" w:type="dxa"/>
+            </w:tcMar>
+          </w:tcPr>
+          <w:p>
+            <w:pPr>
+              <w:jc w:val="left"/>
+            </w:pPr>
+            <w:r>
+              <w:rPr>
+                <w:rFonts w:ascii="Segoe UI" w:hAnsi="Segoe UI"/>
+                <w:b w:val="0"/>
+                <w:i w:val="0"/>
+                <w:color w:val="1E293B"/>
+                <w:sz w:val="18"/>
+              </w:rPr>
+              <w:t>#btn-execute-calc</w:t>
+            </w:r>
+          </w:p>
+        </w:tc>
+        <w:tc>
+          <w:tcPr>
+            <w:tcW w:type="dxa" w:w="1584"/>
+            <w:shd w:fill="F8FAF9"/>
+            <w:tcMar>
+              <w:top w:w="100" w:type="dxa"/>
+              <w:bottom w:w="100" w:type="dxa"/>
+              <w:left w:w="150" w:type="dxa"/>
+              <w:right w:w="150" w:type="dxa"/>
+            </w:tcMar>
+          </w:tcPr>
+          <w:p>
+            <w:pPr>
+              <w:jc w:val="left"/>
+            </w:pPr>
+            <w:r>
+              <w:rPr>
+                <w:rFonts w:ascii="Segoe UI" w:hAnsi="Segoe UI"/>
+                <w:b w:val="0"/>
+                <w:i w:val="0"/>
+                <w:color w:val="1E293B"/>
+                <w:sz w:val="18"/>
+              </w:rPr>
+              <w:t>Button</w:t>
+            </w:r>
+          </w:p>
+        </w:tc>
+        <w:tc>
+          <w:tcPr>
+            <w:tcW w:type="dxa" w:w="3024"/>
+            <w:shd w:fill="F8FAF9"/>
+            <w:tcMar>
+              <w:top w:w="100" w:type="dxa"/>
+              <w:bottom w:w="100" w:type="dxa"/>
+              <w:left w:w="150" w:type="dxa"/>
+              <w:right w:w="150" w:type="dxa"/>
+            </w:tcMar>
+          </w:tcPr>
+          <w:p>
+            <w:pPr>
+              <w:jc w:val="left"/>
+            </w:pPr>
+            <w:r>
+              <w:rPr>
+                <w:rFonts w:ascii="Segoe UI" w:hAnsi="Segoe UI"/>
+                <w:b w:val="0"/>
+                <w:i w:val="0"/>
+                <w:color w:val="1E293B"/>
+                <w:sz w:val="18"/>
+              </w:rPr>
+              <w:t>Executes live rate resolution and displays formula breakdown.</w:t>
+            </w:r>
+          </w:p>
+        </w:tc>
+      </w:tr>
+      <w:tr>
+        <w:tc>
+          <w:tcPr>
+            <w:tcW w:type="dxa" w:w="2160"/>
+            <w:shd w:fill="FFFFFF"/>
+            <w:tcMar>
+              <w:top w:w="100" w:type="dxa"/>
+              <w:bottom w:w="100" w:type="dxa"/>
+              <w:left w:w="150" w:type="dxa"/>
+              <w:right w:w="150" w:type="dxa"/>
+            </w:tcMar>
+          </w:tcPr>
+          <w:p>
+            <w:pPr>
+              <w:jc w:val="left"/>
+            </w:pPr>
+            <w:r>
+              <w:rPr>
+                <w:rFonts w:ascii="Segoe UI" w:hAnsi="Segoe UI"/>
+                <w:b w:val="0"/>
+                <w:i w:val="0"/>
+                <w:color w:val="1E293B"/>
+                <w:sz w:val="18"/>
+              </w:rPr>
+              <w:t>Freight Rate Master (/freight/contracts)</w:t>
+            </w:r>
+          </w:p>
+        </w:tc>
+        <w:tc>
+          <w:tcPr>
+            <w:tcW w:type="dxa" w:w="2592"/>
+            <w:shd w:fill="FFFFFF"/>
+            <w:tcMar>
+              <w:top w:w="100" w:type="dxa"/>
+              <w:bottom w:w="100" w:type="dxa"/>
+              <w:left w:w="150" w:type="dxa"/>
+              <w:right w:w="150" w:type="dxa"/>
+            </w:tcMar>
+          </w:tcPr>
+          <w:p>
+            <w:pPr>
+              <w:jc w:val="left"/>
+            </w:pPr>
+            <w:r>
+              <w:rPr>
+                <w:rFonts w:ascii="Segoe UI" w:hAnsi="Segoe UI"/>
+                <w:b w:val="0"/>
+                <w:i w:val="0"/>
+                <w:color w:val="1E293B"/>
+                <w:sz w:val="18"/>
+              </w:rPr>
+              <w:t>#btn-new-contract</w:t>
+            </w:r>
+          </w:p>
+        </w:tc>
+        <w:tc>
+          <w:tcPr>
+            <w:tcW w:type="dxa" w:w="1584"/>
+            <w:shd w:fill="FFFFFF"/>
+            <w:tcMar>
+              <w:top w:w="100" w:type="dxa"/>
+              <w:bottom w:w="100" w:type="dxa"/>
+              <w:left w:w="150" w:type="dxa"/>
+              <w:right w:w="150" w:type="dxa"/>
+            </w:tcMar>
+          </w:tcPr>
+          <w:p>
+            <w:pPr>
+              <w:jc w:val="left"/>
+            </w:pPr>
+            <w:r>
+              <w:rPr>
+                <w:rFonts w:ascii="Segoe UI" w:hAnsi="Segoe UI"/>
+                <w:b w:val="0"/>
+                <w:i w:val="0"/>
+                <w:color w:val="1E293B"/>
+                <w:sz w:val="18"/>
+              </w:rPr>
+              <w:t>Button [F6]</w:t>
+            </w:r>
+          </w:p>
+        </w:tc>
+        <w:tc>
+          <w:tcPr>
+            <w:tcW w:type="dxa" w:w="3024"/>
+            <w:shd w:fill="FFFFFF"/>
+            <w:tcMar>
+              <w:top w:w="100" w:type="dxa"/>
+              <w:bottom w:w="100" w:type="dxa"/>
+              <w:left w:w="150" w:type="dxa"/>
+              <w:right w:w="150" w:type="dxa"/>
+            </w:tcMar>
+          </w:tcPr>
+          <w:p>
+            <w:pPr>
+              <w:jc w:val="left"/>
+            </w:pPr>
+            <w:r>
+              <w:rPr>
+                <w:rFonts w:ascii="Segoe UI" w:hAnsi="Segoe UI"/>
+                <w:b w:val="0"/>
+                <w:i w:val="0"/>
+                <w:color w:val="1E293B"/>
+                <w:sz w:val="18"/>
+              </w:rPr>
+              <w:t>Opens modal to register new freight contract (#modal-new-contract).</w:t>
+            </w:r>
+          </w:p>
+        </w:tc>
+      </w:tr>
+      <w:tr>
+        <w:tc>
+          <w:tcPr>
+            <w:tcW w:type="dxa" w:w="2160"/>
+            <w:shd w:fill="F8FAF9"/>
+            <w:tcMar>
+              <w:top w:w="100" w:type="dxa"/>
+              <w:bottom w:w="100" w:type="dxa"/>
+              <w:left w:w="150" w:type="dxa"/>
+              <w:right w:w="150" w:type="dxa"/>
+            </w:tcMar>
+          </w:tcPr>
+          <w:p>
+            <w:pPr>
+              <w:jc w:val="left"/>
+            </w:pPr>
+            <w:r>
+              <w:rPr>
+                <w:rFonts w:ascii="Segoe UI" w:hAnsi="Segoe UI"/>
+                <w:b w:val="0"/>
+                <w:i w:val="0"/>
+                <w:color w:val="1E293B"/>
+                <w:sz w:val="18"/>
+              </w:rPr>
+              <w:t>Reconciliation Desk (/freight/reconciliation)</w:t>
+            </w:r>
+          </w:p>
+        </w:tc>
+        <w:tc>
+          <w:tcPr>
+            <w:tcW w:type="dxa" w:w="2592"/>
+            <w:shd w:fill="F8FAF9"/>
+            <w:tcMar>
+              <w:top w:w="100" w:type="dxa"/>
+              <w:bottom w:w="100" w:type="dxa"/>
+              <w:left w:w="150" w:type="dxa"/>
+              <w:right w:w="150" w:type="dxa"/>
+            </w:tcMar>
+          </w:tcPr>
+          <w:p>
+            <w:pPr>
+              <w:jc w:val="left"/>
+            </w:pPr>
+            <w:r>
+              <w:rPr>
+                <w:rFonts w:ascii="Segoe UI" w:hAnsi="Segoe UI"/>
+                <w:b w:val="0"/>
+                <w:i w:val="0"/>
+                <w:color w:val="1E293B"/>
+                <w:sz w:val="18"/>
+              </w:rPr>
+              <w:t>#kpi-total-recons</w:t>
+            </w:r>
+          </w:p>
+        </w:tc>
+        <w:tc>
+          <w:tcPr>
+            <w:tcW w:type="dxa" w:w="1584"/>
+            <w:shd w:fill="F8FAF9"/>
+            <w:tcMar>
+              <w:top w:w="100" w:type="dxa"/>
+              <w:bottom w:w="100" w:type="dxa"/>
+              <w:left w:w="150" w:type="dxa"/>
+              <w:right w:w="150" w:type="dxa"/>
+            </w:tcMar>
+          </w:tcPr>
+          <w:p>
+            <w:pPr>
+              <w:jc w:val="left"/>
+            </w:pPr>
+            <w:r>
+              <w:rPr>
+                <w:rFonts w:ascii="Segoe UI" w:hAnsi="Segoe UI"/>
+                <w:b w:val="0"/>
+                <w:i w:val="0"/>
+                <w:color w:val="1E293B"/>
+                <w:sz w:val="18"/>
+              </w:rPr>
+              <w:t>Card</w:t>
+            </w:r>
+          </w:p>
+        </w:tc>
+        <w:tc>
+          <w:tcPr>
+            <w:tcW w:type="dxa" w:w="3024"/>
+            <w:shd w:fill="F8FAF9"/>
+            <w:tcMar>
+              <w:top w:w="100" w:type="dxa"/>
+              <w:bottom w:w="100" w:type="dxa"/>
+              <w:left w:w="150" w:type="dxa"/>
+              <w:right w:w="150" w:type="dxa"/>
+            </w:tcMar>
+          </w:tcPr>
+          <w:p>
+            <w:pPr>
+              <w:jc w:val="left"/>
+            </w:pPr>
+            <w:r>
+              <w:rPr>
+                <w:rFonts w:ascii="Segoe UI" w:hAnsi="Segoe UI"/>
+                <w:b w:val="0"/>
+                <w:i w:val="0"/>
+                <w:color w:val="1E293B"/>
+                <w:sz w:val="18"/>
+              </w:rPr>
+              <w:t>Displays total transporter statement count and three-way match status.</w:t>
+            </w:r>
+          </w:p>
+        </w:tc>
+      </w:tr>
+      <w:tr>
+        <w:tc>
+          <w:tcPr>
+            <w:tcW w:type="dxa" w:w="2160"/>
+            <w:shd w:fill="FFFFFF"/>
+            <w:tcMar>
+              <w:top w:w="100" w:type="dxa"/>
+              <w:bottom w:w="100" w:type="dxa"/>
+              <w:left w:w="150" w:type="dxa"/>
+              <w:right w:w="150" w:type="dxa"/>
+            </w:tcMar>
+          </w:tcPr>
+          <w:p>
+            <w:pPr>
+              <w:jc w:val="left"/>
+            </w:pPr>
+            <w:r>
+              <w:rPr>
+                <w:rFonts w:ascii="Segoe UI" w:hAnsi="Segoe UI"/>
+                <w:b w:val="0"/>
+                <w:i w:val="0"/>
+                <w:color w:val="1E293B"/>
+                <w:sz w:val="18"/>
+              </w:rPr>
+              <w:t>Reconciliation Desk (/freight/reconciliation)</w:t>
+            </w:r>
+          </w:p>
+        </w:tc>
+        <w:tc>
+          <w:tcPr>
+            <w:tcW w:type="dxa" w:w="2592"/>
+            <w:shd w:fill="FFFFFF"/>
+            <w:tcMar>
+              <w:top w:w="100" w:type="dxa"/>
+              <w:bottom w:w="100" w:type="dxa"/>
+              <w:left w:w="150" w:type="dxa"/>
+              <w:right w:w="150" w:type="dxa"/>
+            </w:tcMar>
+          </w:tcPr>
+          <w:p>
+            <w:pPr>
+              <w:jc w:val="left"/>
+            </w:pPr>
+            <w:r>
+              <w:rPr>
+                <w:rFonts w:ascii="Segoe UI" w:hAnsi="Segoe UI"/>
+                <w:b w:val="0"/>
+                <w:i w:val="0"/>
+                <w:color w:val="1E293B"/>
+                <w:sz w:val="18"/>
+              </w:rPr>
+              <w:t>#btn-enter-transporter-bill</w:t>
+            </w:r>
+          </w:p>
+        </w:tc>
+        <w:tc>
+          <w:tcPr>
+            <w:tcW w:type="dxa" w:w="1584"/>
+            <w:shd w:fill="FFFFFF"/>
+            <w:tcMar>
+              <w:top w:w="100" w:type="dxa"/>
+              <w:bottom w:w="100" w:type="dxa"/>
+              <w:left w:w="150" w:type="dxa"/>
+              <w:right w:w="150" w:type="dxa"/>
+            </w:tcMar>
+          </w:tcPr>
+          <w:p>
+            <w:pPr>
+              <w:jc w:val="left"/>
+            </w:pPr>
+            <w:r>
+              <w:rPr>
+                <w:rFonts w:ascii="Segoe UI" w:hAnsi="Segoe UI"/>
+                <w:b w:val="0"/>
+                <w:i w:val="0"/>
+                <w:color w:val="1E293B"/>
+                <w:sz w:val="18"/>
+              </w:rPr>
+              <w:t>Button [F6]</w:t>
+            </w:r>
+          </w:p>
+        </w:tc>
+        <w:tc>
+          <w:tcPr>
+            <w:tcW w:type="dxa" w:w="3024"/>
+            <w:shd w:fill="FFFFFF"/>
+            <w:tcMar>
+              <w:top w:w="100" w:type="dxa"/>
+              <w:bottom w:w="100" w:type="dxa"/>
+              <w:left w:w="150" w:type="dxa"/>
+              <w:right w:w="150" w:type="dxa"/>
+            </w:tcMar>
+          </w:tcPr>
+          <w:p>
+            <w:pPr>
+              <w:jc w:val="left"/>
+            </w:pPr>
+            <w:r>
+              <w:rPr>
+                <w:rFonts w:ascii="Segoe UI" w:hAnsi="Segoe UI"/>
+                <w:b w:val="0"/>
+                <w:i w:val="0"/>
+                <w:color w:val="1E293B"/>
+                <w:sz w:val="18"/>
+              </w:rPr>
+              <w:t>Opens modal to enter manual transporter invoice for audit (#modal-enter-transporter-bill).</w:t>
+            </w:r>
+          </w:p>
+        </w:tc>
+      </w:tr>
     </w:tbl>
     <w:p>
       <w:pPr>
@@ -17338,7 +18108,7 @@
           <w:color w:val="1E293B"/>
           <w:sz w:val="21"/>
         </w:rPr>
-        <w:t>The software platform maintains 100% automated pass coverage across 14 comprehensive headless Chrome Selenium test suites and continuous live Vercel production audits:</w:t>
+        <w:t>The software platform maintains 100% automated pass coverage across 15 comprehensive headless Chrome Selenium test suites and continuous live Vercel production audits:</w:t>
       </w:r>
     </w:p>
     <w:tbl>
@@ -18538,7 +19308,7 @@
                 <w:color w:val="1E293B"/>
                 <w:sz w:val="18"/>
               </w:rPr>
-              <w:t>verify_live_vercel_receipt_payment_audit.py</w:t>
+              <w:t>test_freight_logistics_selenium.py</w:t>
             </w:r>
           </w:p>
         </w:tc>
@@ -18565,7 +19335,7 @@
                 <w:color w:val="1E293B"/>
                 <w:sz w:val="18"/>
               </w:rPr>
-              <w:t>10 Stages (Live cloud production audit)</w:t>
+              <w:t>10 Stages (Freight &amp; logistics cost engine)</w:t>
             </w:r>
           </w:p>
         </w:tc>
@@ -18592,12 +19362,392 @@
                 <w:color w:val="1E293B"/>
                 <w:sz w:val="18"/>
               </w:rPr>
+              <w:t>100% PASS: Rate contracts, tiered slabs, deterministic calculation, Admin GL 5200 segregation, 3-way transporter reconciliation, [Esc] lifecycle.</w:t>
+            </w:r>
+          </w:p>
+        </w:tc>
+      </w:tr>
+      <w:tr>
+        <w:tc>
+          <w:tcPr>
+            <w:tcW w:type="dxa" w:w="3168"/>
+            <w:shd w:fill="FFFFFF"/>
+            <w:tcMar>
+              <w:top w:w="100" w:type="dxa"/>
+              <w:bottom w:w="100" w:type="dxa"/>
+              <w:left w:w="150" w:type="dxa"/>
+              <w:right w:w="150" w:type="dxa"/>
+            </w:tcMar>
+          </w:tcPr>
+          <w:p>
+            <w:pPr>
+              <w:jc w:val="left"/>
+            </w:pPr>
+            <w:r>
+              <w:rPr>
+                <w:rFonts w:ascii="Segoe UI" w:hAnsi="Segoe UI"/>
+                <w:b w:val="0"/>
+                <w:i w:val="0"/>
+                <w:color w:val="1E293B"/>
+                <w:sz w:val="18"/>
+              </w:rPr>
+              <w:t>verify_live_vercel_receipt_payment_audit.py</w:t>
+            </w:r>
+          </w:p>
+        </w:tc>
+        <w:tc>
+          <w:tcPr>
+            <w:tcW w:type="dxa" w:w="1728"/>
+            <w:shd w:fill="FFFFFF"/>
+            <w:tcMar>
+              <w:top w:w="100" w:type="dxa"/>
+              <w:bottom w:w="100" w:type="dxa"/>
+              <w:left w:w="150" w:type="dxa"/>
+              <w:right w:w="150" w:type="dxa"/>
+            </w:tcMar>
+          </w:tcPr>
+          <w:p>
+            <w:pPr>
+              <w:jc w:val="left"/>
+            </w:pPr>
+            <w:r>
+              <w:rPr>
+                <w:rFonts w:ascii="Segoe UI" w:hAnsi="Segoe UI"/>
+                <w:b w:val="0"/>
+                <w:i w:val="0"/>
+                <w:color w:val="1E293B"/>
+                <w:sz w:val="18"/>
+              </w:rPr>
+              <w:t>10 Stages (Live cloud production audit)</w:t>
+            </w:r>
+          </w:p>
+        </w:tc>
+        <w:tc>
+          <w:tcPr>
+            <w:tcW w:type="dxa" w:w="4464"/>
+            <w:shd w:fill="FFFFFF"/>
+            <w:tcMar>
+              <w:top w:w="100" w:type="dxa"/>
+              <w:bottom w:w="100" w:type="dxa"/>
+              <w:left w:w="150" w:type="dxa"/>
+              <w:right w:w="150" w:type="dxa"/>
+            </w:tcMar>
+          </w:tcPr>
+          <w:p>
+            <w:pPr>
+              <w:jc w:val="left"/>
+            </w:pPr>
+            <w:r>
+              <w:rPr>
+                <w:rFonts w:ascii="Segoe UI" w:hAnsi="Segoe UI"/>
+                <w:b w:val="0"/>
+                <w:i w:val="0"/>
+                <w:color w:val="1E293B"/>
+                <w:sz w:val="18"/>
+              </w:rPr>
               <w:t>100% PASS: Live production verification on https://erp-rho-three.vercel.app with zero regressions and complete visual screenshot artifacts.</w:t>
             </w:r>
           </w:p>
         </w:tc>
       </w:tr>
     </w:tbl>
+    <w:p>
+      <w:pPr>
+        <w:spacing w:after="240"/>
+      </w:pPr>
+    </w:p>
+    <w:p>
+      <w:pPr>
+        <w:keepNext/>
+        <w:spacing w:before="360" w:after="160"/>
+      </w:pPr>
+      <w:r>
+        <w:rPr>
+          <w:rFonts w:ascii="Segoe UI" w:hAnsi="Segoe UI"/>
+          <w:b/>
+          <w:i w:val="0"/>
+          <w:color w:val="1B4332"/>
+          <w:sz w:val="36"/>
+        </w:rPr>
+        <w:t>21. Freight &amp; Logistics Cost &amp; Recovery Engine (DOC-35)</w:t>
+      </w:r>
+    </w:p>
+    <w:p>
+      <w:pPr>
+        <w:spacing w:before="0" w:after="120" w:line="276" w:lineRule="auto"/>
+        <w:jc w:val="left"/>
+      </w:pPr>
+      <w:r>
+        <w:rPr>
+          <w:rFonts w:ascii="Segoe UI" w:hAnsi="Segoe UI"/>
+          <w:b w:val="0"/>
+          <w:i w:val="0"/>
+          <w:color w:val="1E293B"/>
+          <w:sz w:val="21"/>
+        </w:rPr>
+        <w:t>DOC-35 defines the centralized freight calculation, rate resolution, cost allocation, commercial recovery, and three-way transporter reconciliation engine for the enterprise ERP.</w:t>
+      </w:r>
+    </w:p>
+    <w:tbl>
+      <w:tblPr>
+        <w:tblW w:type="auto" w:w="0"/>
+        <w:jc w:val="center"/>
+        <w:tblLook w:firstColumn="1" w:firstRow="1" w:lastColumn="0" w:lastRow="0" w:noHBand="0" w:noVBand="1" w:val="04A0"/>
+      </w:tblPr>
+      <w:tblGrid>
+        <w:gridCol w:w="9360"/>
+      </w:tblGrid>
+      <w:tr>
+        <w:tc>
+          <w:tcPr>
+            <w:tcW w:type="dxa" w:w="9360"/>
+            <w:shd w:fill="EEF7F2"/>
+            <w:tcMar>
+              <w:top w:w="140" w:type="dxa"/>
+              <w:bottom w:w="140" w:type="dxa"/>
+              <w:left w:w="200" w:type="dxa"/>
+              <w:right w:w="180" w:type="dxa"/>
+            </w:tcMar>
+            <w:tcBorders>
+              <w:left w:val="single" w:sz="24" w:space="0" w:color="1B4332"/>
+              <w:top w:val="none"/>
+              <w:right w:val="none"/>
+              <w:bottom w:val="none"/>
+            </w:tcBorders>
+          </w:tcPr>
+          <w:p>
+            <w:pPr>
+              <w:spacing w:before="40" w:after="40"/>
+            </w:pPr>
+            <w:r>
+              <w:rPr>
+                <w:rFonts w:ascii="Segoe UI" w:hAnsi="Segoe UI"/>
+                <w:b/>
+                <w:i w:val="0"/>
+                <w:color w:val="1B4332"/>
+                <w:sz w:val="19"/>
+              </w:rPr>
+              <w:t xml:space="preserve">DOC-35 CORE MANDATE: </w:t>
+            </w:r>
+            <w:r>
+              <w:rPr>
+                <w:rFonts w:ascii="Segoe UI" w:hAnsi="Segoe UI"/>
+                <w:b w:val="0"/>
+                <w:i w:val="0"/>
+                <w:color w:val="1E293B"/>
+                <w:sz w:val="19"/>
+              </w:rPr>
+              <w:t>DOC-35 ARCHITECTURAL INVARIANTS &amp; CORE DESIGN PRINCIPLES:</w:t>
+              <w:br/>
+              <w:t>1. Strict Separation of Cost, Recovery, and Logistics Margin: Transporter cost incurred is never conflated with or silently offset by customer/principal recoveries.</w:t>
+              <w:br/>
+              <w:t>2. First-Class Cost Bearer Policy: When Platform Admin is configured as cost bearer for client company dispatches, the accounting expense posts exclusively to Account 5200 in the Platform Admin General Ledger; the Client Company General Ledger maintains zero auto-debits.</w:t>
+              <w:br/>
+              <w:t>3. Deterministic Explainability Snapshots: Every calculation generates an immutable JSON snapshot with inputs, formula traces, and rule versions.</w:t>
+              <w:br/>
+              <w:t>4. Three-Way Transporter Billing &amp; Reconciliation: Transporter invoices are audited against system-expected costs with automated variance status tagging (MATCHED, TOLERABLE, UNAPPROVED_EXCESS, DISPUTED) and 1-click GL posting.</w:t>
+            </w:r>
+          </w:p>
+        </w:tc>
+      </w:tr>
+    </w:tbl>
+    <w:p>
+      <w:pPr>
+        <w:spacing w:after="80"/>
+      </w:pPr>
+    </w:p>
+    <w:p>
+      <w:pPr>
+        <w:keepNext/>
+        <w:spacing w:before="280" w:after="120"/>
+      </w:pPr>
+      <w:r>
+        <w:rPr>
+          <w:rFonts w:ascii="Segoe UI" w:hAnsi="Segoe UI"/>
+          <w:b/>
+          <w:i w:val="0"/>
+          <w:color w:val="2D6A4F"/>
+          <w:sz w:val="27"/>
+        </w:rPr>
+        <w:t>21.1 Implemented Relational Schema &amp; Backend Services</w:t>
+      </w:r>
+    </w:p>
+    <w:p>
+      <w:pPr>
+        <w:spacing w:before="0" w:after="120" w:line="276" w:lineRule="auto"/>
+        <w:jc w:val="left"/>
+      </w:pPr>
+      <w:r>
+        <w:rPr>
+          <w:rFonts w:ascii="Segoe UI" w:hAnsi="Segoe UI"/>
+          <w:b w:val="0"/>
+          <w:i w:val="0"/>
+          <w:color w:val="1E293B"/>
+          <w:sz w:val="21"/>
+        </w:rPr>
+        <w:t>DOC-35 introduces 11 relational entities mapped via SQLAlchemy 2.0 and mounted under /api/freight:</w:t>
+      </w:r>
+    </w:p>
+    <w:p>
+      <w:pPr>
+        <w:spacing w:before="0" w:after="120" w:line="276" w:lineRule="auto"/>
+        <w:jc w:val="left"/>
+      </w:pPr>
+      <w:r>
+        <w:rPr>
+          <w:rFonts w:ascii="Segoe UI" w:hAnsi="Segoe UI"/>
+          <w:b w:val="0"/>
+          <w:i w:val="0"/>
+          <w:color w:val="1E293B"/>
+          <w:sz w:val="21"/>
+        </w:rPr>
+        <w:t>• FreightContract &amp; FreightLane: Transporter contract master with priority, vehicle classes, and origin-destination distance matrices.</w:t>
+      </w:r>
+    </w:p>
+    <w:p>
+      <w:pPr>
+        <w:spacing w:before="0" w:after="120" w:line="276" w:lineRule="auto"/>
+        <w:jc w:val="left"/>
+      </w:pPr>
+      <w:r>
+        <w:rPr>
+          <w:rFonts w:ascii="Segoe UI" w:hAnsi="Segoe UI"/>
+          <w:b w:val="0"/>
+          <w:i w:val="0"/>
+          <w:color w:val="1E293B"/>
+          <w:sz w:val="21"/>
+        </w:rPr>
+        <w:t>• FreightRateRule &amp; FreightAncillaryRule: Tiered weight slabs, base rates, minimum charges, and ancillary surcharges (Loading ₹300, Toll ₹450, Hamali ₹15/pkg, Transit Cover 0.5%, Demurrage ₹500).</w:t>
+      </w:r>
+    </w:p>
+    <w:p>
+      <w:pPr>
+        <w:spacing w:before="0" w:after="120" w:line="276" w:lineRule="auto"/>
+        <w:jc w:val="left"/>
+      </w:pPr>
+      <w:r>
+        <w:rPr>
+          <w:rFonts w:ascii="Segoe UI" w:hAnsi="Segoe UI"/>
+          <w:b w:val="0"/>
+          <w:i w:val="0"/>
+          <w:color w:val="1E293B"/>
+          <w:sz w:val="21"/>
+        </w:rPr>
+        <w:t>• FreightCostEvent &amp; FreightCalculationSnapshot: Atomic cost facts linked to DOC-34 consignments with complete formula explainability traces.</w:t>
+      </w:r>
+    </w:p>
+    <w:p>
+      <w:pPr>
+        <w:spacing w:before="0" w:after="120" w:line="276" w:lineRule="auto"/>
+        <w:jc w:val="left"/>
+      </w:pPr>
+      <w:r>
+        <w:rPr>
+          <w:rFonts w:ascii="Segoe UI" w:hAnsi="Segoe UI"/>
+          <w:b w:val="0"/>
+          <w:i w:val="0"/>
+          <w:color w:val="1E293B"/>
+          <w:sz w:val="21"/>
+        </w:rPr>
+        <w:t>• FreightAllocation &amp; FreightRecovery: Multi-document proportional splitting (Weight, Value, Packages, Equal) and commercial customer/principal recovery accounting.</w:t>
+      </w:r>
+    </w:p>
+    <w:p>
+      <w:pPr>
+        <w:spacing w:before="0" w:after="120" w:line="276" w:lineRule="auto"/>
+        <w:jc w:val="left"/>
+      </w:pPr>
+      <w:r>
+        <w:rPr>
+          <w:rFonts w:ascii="Segoe UI" w:hAnsi="Segoe UI"/>
+          <w:b w:val="0"/>
+          <w:i w:val="0"/>
+          <w:color w:val="1E293B"/>
+          <w:sz w:val="21"/>
+        </w:rPr>
+        <w:t>• FreightReconciliation: Three-way match workbench for auditing transporter statements against expected dispatches.</w:t>
+      </w:r>
+    </w:p>
+    <w:p>
+      <w:pPr>
+        <w:keepNext/>
+        <w:spacing w:before="280" w:after="120"/>
+      </w:pPr>
+      <w:r>
+        <w:rPr>
+          <w:rFonts w:ascii="Segoe UI" w:hAnsi="Segoe UI"/>
+          <w:b/>
+          <w:i w:val="0"/>
+          <w:color w:val="2D6A4F"/>
+          <w:sz w:val="27"/>
+        </w:rPr>
+        <w:t>21.2 Interactive UI Cockpits &amp; Verification Proof</w:t>
+      </w:r>
+    </w:p>
+    <w:p>
+      <w:pPr>
+        <w:spacing w:before="0" w:after="120" w:line="276" w:lineRule="auto"/>
+        <w:jc w:val="left"/>
+      </w:pPr>
+      <w:r>
+        <w:rPr>
+          <w:rFonts w:ascii="Segoe UI" w:hAnsi="Segoe UI"/>
+          <w:b w:val="0"/>
+          <w:i w:val="0"/>
+          <w:color w:val="1E293B"/>
+          <w:sz w:val="21"/>
+        </w:rPr>
+        <w:t>The frontend delivers two dedicated luxury Marg-themed cockpits:</w:t>
+      </w:r>
+    </w:p>
+    <w:p>
+      <w:pPr>
+        <w:spacing w:before="0" w:after="120" w:line="276" w:lineRule="auto"/>
+        <w:jc w:val="left"/>
+      </w:pPr>
+      <w:r>
+        <w:rPr>
+          <w:rFonts w:ascii="Segoe UI" w:hAnsi="Segoe UI"/>
+          <w:b w:val="0"/>
+          <w:i w:val="0"/>
+          <w:color w:val="1E293B"/>
+          <w:sz w:val="21"/>
+        </w:rPr>
+        <w:t>1. Freight Rate Master (/freight/contracts): 4 Top KPI cards, rate card matrix, and an interactive Calculation Sandbox with live parameter inputs and formula trace rendering.</w:t>
+      </w:r>
+    </w:p>
+    <w:p>
+      <w:pPr>
+        <w:spacing w:before="0" w:after="120" w:line="276" w:lineRule="auto"/>
+        <w:jc w:val="left"/>
+      </w:pPr>
+      <w:r>
+        <w:rPr>
+          <w:rFonts w:ascii="Segoe UI" w:hAnsi="Segoe UI"/>
+          <w:b w:val="0"/>
+          <w:i w:val="0"/>
+          <w:color w:val="1E293B"/>
+          <w:sz w:val="21"/>
+        </w:rPr>
+        <w:t>2. Transporter Billing &amp; Reconciliation Desk (/freight/reconciliation): Complete statement audit grid with variance thresholds, dispute logging, and 1-click GL posting to Account 5200.</w:t>
+      </w:r>
+    </w:p>
+    <w:p>
+      <w:pPr>
+        <w:spacing w:before="0" w:after="120" w:line="276" w:lineRule="auto"/>
+        <w:jc w:val="left"/>
+      </w:pPr>
+      <w:r>
+        <w:rPr>
+          <w:rFonts w:ascii="Segoe UI" w:hAnsi="Segoe UI"/>
+          <w:b w:val="0"/>
+          <w:i w:val="0"/>
+          <w:color w:val="1E293B"/>
+          <w:sz w:val="21"/>
+        </w:rPr>
+        <w:t>3. Zero-Mouse Operational Guarantee: 100% keyboard navigable with [F6] New Contract/Bill modal, [F4] Sandbox toggle, [Esc] hierarchical dismissal, and [Ctrl+2] Counter Workbench hotkey.</w:t>
+      </w:r>
+    </w:p>
     <w:p>
       <w:pPr>
         <w:spacing w:after="240"/>

</xml_diff>

<commit_message>
feat(principal): implement DOC-36 Principal and CandF Operations Management Engine with 16 PostgreSQL models, full REST API, luxury cockpits, and 100 percent verified test suite
</commit_message>
<xml_diff>
--- a/ERP_ENTERPRISE_SYSTEM_COMPLETE_SOFTWARE_MASTER_WALKTHROUGH.docx
+++ b/ERP_ENTERPRISE_SYSTEM_COMPLETE_SOFTWARE_MASTER_WALKTHROUGH.docx
@@ -19391,7 +19391,7 @@
                 <w:color w:val="1E293B"/>
                 <w:sz w:val="18"/>
               </w:rPr>
-              <w:t>verify_live_vercel_receipt_payment_audit.py</w:t>
+              <w:t>test_principal_operations_selenium.py</w:t>
             </w:r>
           </w:p>
         </w:tc>
@@ -19418,7 +19418,7 @@
                 <w:color w:val="1E293B"/>
                 <w:sz w:val="18"/>
               </w:rPr>
-              <w:t>10 Stages (Live cloud production audit)</w:t>
+              <w:t>10 Stages (Principal &amp; C&amp;F operations engine)</w:t>
             </w:r>
           </w:p>
         </w:tc>
@@ -19426,6 +19426,89 @@
           <w:tcPr>
             <w:tcW w:type="dxa" w:w="4464"/>
             <w:shd w:fill="FFFFFF"/>
+            <w:tcMar>
+              <w:top w:w="100" w:type="dxa"/>
+              <w:bottom w:w="100" w:type="dxa"/>
+              <w:left w:w="150" w:type="dxa"/>
+              <w:right w:w="150" w:type="dxa"/>
+            </w:tcMar>
+          </w:tcPr>
+          <w:p>
+            <w:pPr>
+              <w:jc w:val="left"/>
+            </w:pPr>
+            <w:r>
+              <w:rPr>
+                <w:rFonts w:ascii="Segoe UI" w:hAnsi="Segoe UI"/>
+                <w:b w:val="0"/>
+                <w:i w:val="0"/>
+                <w:color w:val="1E293B"/>
+                <w:sz w:val="18"/>
+              </w:rPr>
+              <w:t>100% PASS: Agreement catalog, stock custody segregation, breakage claims workflow, 3-way reconciliation match, reconstructable statement desk, [Esc] lifecycle.</w:t>
+            </w:r>
+          </w:p>
+        </w:tc>
+      </w:tr>
+      <w:tr>
+        <w:tc>
+          <w:tcPr>
+            <w:tcW w:type="dxa" w:w="3168"/>
+            <w:shd w:fill="F8FAF9"/>
+            <w:tcMar>
+              <w:top w:w="100" w:type="dxa"/>
+              <w:bottom w:w="100" w:type="dxa"/>
+              <w:left w:w="150" w:type="dxa"/>
+              <w:right w:w="150" w:type="dxa"/>
+            </w:tcMar>
+          </w:tcPr>
+          <w:p>
+            <w:pPr>
+              <w:jc w:val="left"/>
+            </w:pPr>
+            <w:r>
+              <w:rPr>
+                <w:rFonts w:ascii="Segoe UI" w:hAnsi="Segoe UI"/>
+                <w:b w:val="0"/>
+                <w:i w:val="0"/>
+                <w:color w:val="1E293B"/>
+                <w:sz w:val="18"/>
+              </w:rPr>
+              <w:t>verify_live_vercel_receipt_payment_audit.py</w:t>
+            </w:r>
+          </w:p>
+        </w:tc>
+        <w:tc>
+          <w:tcPr>
+            <w:tcW w:type="dxa" w:w="1728"/>
+            <w:shd w:fill="F8FAF9"/>
+            <w:tcMar>
+              <w:top w:w="100" w:type="dxa"/>
+              <w:bottom w:w="100" w:type="dxa"/>
+              <w:left w:w="150" w:type="dxa"/>
+              <w:right w:w="150" w:type="dxa"/>
+            </w:tcMar>
+          </w:tcPr>
+          <w:p>
+            <w:pPr>
+              <w:jc w:val="left"/>
+            </w:pPr>
+            <w:r>
+              <w:rPr>
+                <w:rFonts w:ascii="Segoe UI" w:hAnsi="Segoe UI"/>
+                <w:b w:val="0"/>
+                <w:i w:val="0"/>
+                <w:color w:val="1E293B"/>
+                <w:sz w:val="18"/>
+              </w:rPr>
+              <w:t>10 Stages (Live cloud production audit)</w:t>
+            </w:r>
+          </w:p>
+        </w:tc>
+        <w:tc>
+          <w:tcPr>
+            <w:tcW w:type="dxa" w:w="4464"/>
+            <w:shd w:fill="F8FAF9"/>
             <w:tcMar>
               <w:top w:w="100" w:type="dxa"/>
               <w:bottom w:w="100" w:type="dxa"/>
@@ -19746,6 +19829,351 @@
           <w:sz w:val="21"/>
         </w:rPr>
         <w:t>3. Zero-Mouse Operational Guarantee: 100% keyboard navigable with [F6] New Contract/Bill modal, [F4] Sandbox toggle, [Esc] hierarchical dismissal, and [Ctrl+2] Counter Workbench hotkey.</w:t>
+      </w:r>
+    </w:p>
+    <w:p>
+      <w:pPr>
+        <w:spacing w:after="240"/>
+      </w:pPr>
+    </w:p>
+    <w:p>
+      <w:pPr>
+        <w:keepNext/>
+        <w:spacing w:before="360" w:after="160"/>
+      </w:pPr>
+      <w:r>
+        <w:rPr>
+          <w:rFonts w:ascii="Segoe UI" w:hAnsi="Segoe UI"/>
+          <w:b/>
+          <w:i w:val="0"/>
+          <w:color w:val="1B4332"/>
+          <w:sz w:val="36"/>
+        </w:rPr>
+        <w:t>22. Principal &amp; C&amp;F Operations Management Engine (DOC-36)</w:t>
+      </w:r>
+    </w:p>
+    <w:p>
+      <w:pPr>
+        <w:spacing w:before="0" w:after="120" w:line="276" w:lineRule="auto"/>
+        <w:jc w:val="left"/>
+      </w:pPr>
+      <w:r>
+        <w:rPr>
+          <w:rFonts w:ascii="Segoe UI" w:hAnsi="Segoe UI"/>
+          <w:b w:val="0"/>
+          <w:i w:val="0"/>
+          <w:color w:val="1E293B"/>
+          <w:sz w:val="21"/>
+        </w:rPr>
+        <w:t>DOC-36 establishes the operational engine that transforms Principal and C&amp;F relationships from static master definitions into a continuously auditable, traceable operating position.</w:t>
+      </w:r>
+    </w:p>
+    <w:tbl>
+      <w:tblPr>
+        <w:tblW w:type="auto" w:w="0"/>
+        <w:jc w:val="center"/>
+        <w:tblLook w:firstColumn="1" w:firstRow="1" w:lastColumn="0" w:lastRow="0" w:noHBand="0" w:noVBand="1" w:val="04A0"/>
+      </w:tblPr>
+      <w:tblGrid>
+        <w:gridCol w:w="9360"/>
+      </w:tblGrid>
+      <w:tr>
+        <w:tc>
+          <w:tcPr>
+            <w:tcW w:type="dxa" w:w="9360"/>
+            <w:shd w:fill="EEF7F2"/>
+            <w:tcMar>
+              <w:top w:w="140" w:type="dxa"/>
+              <w:bottom w:w="140" w:type="dxa"/>
+              <w:left w:w="200" w:type="dxa"/>
+              <w:right w:w="180" w:type="dxa"/>
+            </w:tcMar>
+            <w:tcBorders>
+              <w:left w:val="single" w:sz="24" w:space="0" w:color="1B4332"/>
+              <w:top w:val="none"/>
+              <w:right w:val="none"/>
+              <w:bottom w:val="none"/>
+            </w:tcBorders>
+          </w:tcPr>
+          <w:p>
+            <w:pPr>
+              <w:spacing w:before="40" w:after="40"/>
+            </w:pPr>
+            <w:r>
+              <w:rPr>
+                <w:rFonts w:ascii="Segoe UI" w:hAnsi="Segoe UI"/>
+                <w:b/>
+                <w:i w:val="0"/>
+                <w:color w:val="1B4332"/>
+                <w:sz w:val="19"/>
+              </w:rPr>
+              <w:t xml:space="preserve">DOC-36 CORE MANDATE: </w:t>
+            </w:r>
+            <w:r>
+              <w:rPr>
+                <w:rFonts w:ascii="Segoe UI" w:hAnsi="Segoe UI"/>
+                <w:b w:val="0"/>
+                <w:i w:val="0"/>
+                <w:color w:val="1E293B"/>
+                <w:sz w:val="19"/>
+              </w:rPr>
+              <w:t>DOC-36 ARCHITECTURAL INVARIANTS &amp; CORE DESIGN PRINCIPLES:</w:t>
+              <w:br/>
+              <w:t>1. Zero Duplicate Engines: DOC-36 orchestrates Principal context across DOC-12 (Master), DOC-14 (Schemes), DOC-16 (Stock Movement), DOC-08 (GL Postings), DOC-07 (Settlements), and DOC-35 (Freight) without duplicate ledgers.</w:t>
+              <w:br/>
+              <w:t>2. Owner Separation at SKU/Batch Level: Principal ownership is an explicit relational dimension. Multiple Principals can stock identical SKUs in the same warehouse without cross-owner stock pollution or commingling.</w:t>
+              <w:br/>
+              <w:t>3. Non-Editable Reconstructable Statements: Principal stock statements and commercial balances are mathematically reconstructed from source movements and immutable events. Manual balance overrides are strictly prohibited.</w:t>
+              <w:br/>
+              <w:t>4. Reconciliation Variance Immutability: Reconciliation cannot alter historical transaction ledgers; variances generate audit trails and follow-up adjustment or claim documents with four-eyes approval.</w:t>
+            </w:r>
+          </w:p>
+        </w:tc>
+      </w:tr>
+    </w:tbl>
+    <w:p>
+      <w:pPr>
+        <w:spacing w:after="80"/>
+      </w:pPr>
+    </w:p>
+    <w:p>
+      <w:pPr>
+        <w:keepNext/>
+        <w:spacing w:before="280" w:after="120"/>
+      </w:pPr>
+      <w:r>
+        <w:rPr>
+          <w:rFonts w:ascii="Segoe UI" w:hAnsi="Segoe UI"/>
+          <w:b/>
+          <w:i w:val="0"/>
+          <w:color w:val="2D6A4F"/>
+          <w:sz w:val="27"/>
+        </w:rPr>
+        <w:t>22.1 Implemented Relational Schema &amp; Backend Services</w:t>
+      </w:r>
+    </w:p>
+    <w:p>
+      <w:pPr>
+        <w:spacing w:before="0" w:after="120" w:line="276" w:lineRule="auto"/>
+        <w:jc w:val="left"/>
+      </w:pPr>
+      <w:r>
+        <w:rPr>
+          <w:rFonts w:ascii="Segoe UI" w:hAnsi="Segoe UI"/>
+          <w:b w:val="0"/>
+          <w:i w:val="0"/>
+          <w:color w:val="1E293B"/>
+          <w:sz w:val="21"/>
+        </w:rPr>
+        <w:t>DOC-36 introduces 16 relational entities mapped via SQLAlchemy 2.0 and mounted under /api/principal:</w:t>
+      </w:r>
+    </w:p>
+    <w:p>
+      <w:pPr>
+        <w:spacing w:before="0" w:after="120" w:line="276" w:lineRule="auto"/>
+        <w:jc w:val="left"/>
+      </w:pPr>
+      <w:r>
+        <w:rPr>
+          <w:rFonts w:ascii="Segoe UI" w:hAnsi="Segoe UI"/>
+          <w:b w:val="0"/>
+          <w:i w:val="0"/>
+          <w:color w:val="1E293B"/>
+          <w:sz w:val="21"/>
+        </w:rPr>
+        <w:t>• PrincipalOperatingContext &amp; PrincipalAgreementVersion: Master operational context with effective-dated terms, commission rates, and logistics policies.</w:t>
+      </w:r>
+    </w:p>
+    <w:p>
+      <w:pPr>
+        <w:spacing w:before="0" w:after="120" w:line="276" w:lineRule="auto"/>
+        <w:jc w:val="left"/>
+      </w:pPr>
+      <w:r>
+        <w:rPr>
+          <w:rFonts w:ascii="Segoe UI" w:hAnsi="Segoe UI"/>
+          <w:b w:val="0"/>
+          <w:i w:val="0"/>
+          <w:color w:val="1E293B"/>
+          <w:sz w:val="21"/>
+        </w:rPr>
+        <w:t>• PrincipalProductRule, PrincipalCustomerRule &amp; PrincipalOwnershipRule: Authorized product catalog, territory eligibility, and stock ownership custody modes (CONSIGNMENT_CUSTODY).</w:t>
+      </w:r>
+    </w:p>
+    <w:p>
+      <w:pPr>
+        <w:spacing w:before="0" w:after="120" w:line="276" w:lineRule="auto"/>
+        <w:jc w:val="left"/>
+      </w:pPr>
+      <w:r>
+        <w:rPr>
+          <w:rFonts w:ascii="Segoe UI" w:hAnsi="Segoe UI"/>
+          <w:b w:val="0"/>
+          <w:i w:val="0"/>
+          <w:color w:val="1E293B"/>
+          <w:sz w:val="21"/>
+        </w:rPr>
+        <w:t>• PrincipalEvent &amp; PrincipalStockSnapshot: Cryptographically hashed commercial event log and point-in-time cached stock positions segregated by SKU and batch.</w:t>
+      </w:r>
+    </w:p>
+    <w:p>
+      <w:pPr>
+        <w:spacing w:before="0" w:after="120" w:line="276" w:lineRule="auto"/>
+        <w:jc w:val="left"/>
+      </w:pPr>
+      <w:r>
+        <w:rPr>
+          <w:rFonts w:ascii="Segoe UI" w:hAnsi="Segoe UI"/>
+          <w:b w:val="0"/>
+          <w:i w:val="0"/>
+          <w:color w:val="1E293B"/>
+          <w:sz w:val="21"/>
+        </w:rPr>
+        <w:t>• PrincipalClaim &amp; PrincipalClaimLine: Operational claims (Expiry, Breakage, Shortage, Rate Difference) with batch provenance and multi-stage approval workflows.</w:t>
+      </w:r>
+    </w:p>
+    <w:p>
+      <w:pPr>
+        <w:spacing w:before="0" w:after="120" w:line="276" w:lineRule="auto"/>
+        <w:jc w:val="left"/>
+      </w:pPr>
+      <w:r>
+        <w:rPr>
+          <w:rFonts w:ascii="Segoe UI" w:hAnsi="Segoe UI"/>
+          <w:b w:val="0"/>
+          <w:i w:val="0"/>
+          <w:color w:val="1E293B"/>
+          <w:sz w:val="21"/>
+        </w:rPr>
+        <w:t>• PrincipalReconciliation &amp; PrincipalReconciliationLine: 3-way automated matching engine comparing physical stock against external Principal statements.</w:t>
+      </w:r>
+    </w:p>
+    <w:p>
+      <w:pPr>
+        <w:spacing w:before="0" w:after="120" w:line="276" w:lineRule="auto"/>
+        <w:jc w:val="left"/>
+      </w:pPr>
+      <w:r>
+        <w:rPr>
+          <w:rFonts w:ascii="Segoe UI" w:hAnsi="Segoe UI"/>
+          <w:b w:val="0"/>
+          <w:i w:val="0"/>
+          <w:color w:val="1E293B"/>
+          <w:sz w:val="21"/>
+        </w:rPr>
+        <w:t>• PrincipalStatementRun &amp; PrincipalStatementLine: Authoritative period statements with drill-down line items.</w:t>
+      </w:r>
+    </w:p>
+    <w:p>
+      <w:pPr>
+        <w:spacing w:before="0" w:after="120" w:line="276" w:lineRule="auto"/>
+        <w:jc w:val="left"/>
+      </w:pPr>
+      <w:r>
+        <w:rPr>
+          <w:rFonts w:ascii="Segoe UI" w:hAnsi="Segoe UI"/>
+          <w:b w:val="0"/>
+          <w:i w:val="0"/>
+          <w:color w:val="1E293B"/>
+          <w:sz w:val="21"/>
+        </w:rPr>
+        <w:t>• PrincipalCostAttribution &amp; PrincipalCommissionRef: Attributed logistics costs (DOC-35 integration) and commission links (DOC-37).</w:t>
+      </w:r>
+    </w:p>
+    <w:p>
+      <w:pPr>
+        <w:keepNext/>
+        <w:spacing w:before="280" w:after="120"/>
+      </w:pPr>
+      <w:r>
+        <w:rPr>
+          <w:rFonts w:ascii="Segoe UI" w:hAnsi="Segoe UI"/>
+          <w:b/>
+          <w:i w:val="0"/>
+          <w:color w:val="2D6A4F"/>
+          <w:sz w:val="27"/>
+        </w:rPr>
+        <w:t>22.2 Interactive UI Cockpits &amp; Verification Proof</w:t>
+      </w:r>
+    </w:p>
+    <w:p>
+      <w:pPr>
+        <w:spacing w:before="0" w:after="120" w:line="276" w:lineRule="auto"/>
+        <w:jc w:val="left"/>
+      </w:pPr>
+      <w:r>
+        <w:rPr>
+          <w:rFonts w:ascii="Segoe UI" w:hAnsi="Segoe UI"/>
+          <w:b w:val="0"/>
+          <w:i w:val="0"/>
+          <w:color w:val="1E293B"/>
+          <w:sz w:val="21"/>
+        </w:rPr>
+        <w:t>The frontend delivers two dedicated luxury Marg-themed cockpits:</w:t>
+      </w:r>
+    </w:p>
+    <w:p>
+      <w:pPr>
+        <w:spacing w:before="0" w:after="120" w:line="276" w:lineRule="auto"/>
+        <w:jc w:val="left"/>
+      </w:pPr>
+      <w:r>
+        <w:rPr>
+          <w:rFonts w:ascii="Segoe UI" w:hAnsi="Segoe UI"/>
+          <w:b w:val="0"/>
+          <w:i w:val="0"/>
+          <w:color w:val="1E293B"/>
+          <w:sz w:val="21"/>
+        </w:rPr>
+        <w:t>1. Principal Operational Control Center (/principal): 5 Top KPI cards, Stock Ownership &amp; Custody Matrix [F2], Claims &amp; Returns Desk [F3], 3-Way Reconciliation Workspace [F4], Authoritative Statement [F5], Commercial MIS [F6], and New Claim Modal [F7].</w:t>
+      </w:r>
+    </w:p>
+    <w:p>
+      <w:pPr>
+        <w:spacing w:before="0" w:after="120" w:line="276" w:lineRule="auto"/>
+        <w:jc w:val="left"/>
+      </w:pPr>
+      <w:r>
+        <w:rPr>
+          <w:rFonts w:ascii="Segoe UI" w:hAnsi="Segoe UI"/>
+          <w:b w:val="0"/>
+          <w:i w:val="0"/>
+          <w:color w:val="1E293B"/>
+          <w:sz w:val="21"/>
+        </w:rPr>
+        <w:t>2. Principal Business Statement Desk (/principal/statement): Full-screen drill-down statement screen showing source transactions, batches, and settlement links.</w:t>
+      </w:r>
+    </w:p>
+    <w:p>
+      <w:pPr>
+        <w:spacing w:before="0" w:after="120" w:line="276" w:lineRule="auto"/>
+        <w:jc w:val="left"/>
+      </w:pPr>
+      <w:r>
+        <w:rPr>
+          <w:rFonts w:ascii="Segoe UI" w:hAnsi="Segoe UI"/>
+          <w:b w:val="0"/>
+          <w:i w:val="0"/>
+          <w:color w:val="1E293B"/>
+          <w:sz w:val="21"/>
+        </w:rPr>
+        <w:t>3. Counter Workbench Launcher (#hub-btn-principal-management): Instant access via global hotkey [Ctrl+3].</w:t>
+      </w:r>
+    </w:p>
+    <w:p>
+      <w:pPr>
+        <w:spacing w:before="0" w:after="120" w:line="276" w:lineRule="auto"/>
+        <w:jc w:val="left"/>
+      </w:pPr>
+      <w:r>
+        <w:rPr>
+          <w:rFonts w:ascii="Segoe UI" w:hAnsi="Segoe UI"/>
+          <w:b w:val="0"/>
+          <w:i w:val="0"/>
+          <w:color w:val="1E293B"/>
+          <w:sz w:val="21"/>
+        </w:rPr>
+        <w:t>4. Zero-Mouse Operational Guarantee: 100% keyboard navigable with [F2]-[F7] hotkeys and [Esc] hierarchical dismissal.</w:t>
       </w:r>
     </w:p>
     <w:p>

</xml_diff>